<commit_message>
#1089 - feature/core: move ns-symbols to feature/env
</commit_message>
<xml_diff>
--- a/doc/refcards/mu-ref.docx
+++ b/doc/refcards/mu-ref.docx
@@ -64,7 +64,7 @@
           <w:tab w:val="left" w:pos="4110" w:leader="none"/>
         </w:tabs>
         <w:suppressAutoHyphens w:val="true"/>
-        <w:overflowPunct w:val="true"/>
+        <w:overflowPunct w:val="false"/>
         <w:bidi w:val="0"/>
         <w:spacing w:before="0" w:after="0"/>
         <w:ind w:hanging="0" w:left="0" w:right="0"/>
@@ -2161,7 +2161,7 @@
         <w:pStyle w:val="Normal"/>
         <w:widowControl/>
         <w:suppressAutoHyphens w:val="true"/>
-        <w:overflowPunct w:val="true"/>
+        <w:overflowPunct w:val="false"/>
         <w:bidi w:val="0"/>
         <w:spacing w:before="0" w:after="0"/>
         <w:ind w:hanging="0" w:left="0" w:right="0"/>
@@ -5562,7 +5562,7 @@
         <w:pStyle w:val="Normal"/>
         <w:widowControl/>
         <w:suppressAutoHyphens w:val="true"/>
-        <w:overflowPunct w:val="true"/>
+        <w:overflowPunct w:val="false"/>
         <w:bidi w:val="0"/>
         <w:spacing w:before="0" w:after="0"/>
         <w:ind w:hanging="0" w:left="0" w:right="0"/>
@@ -14509,19 +14509,7 @@
           <w:szCs w:val="24"/>
           <w:shd w:fill="333333" w:val="clear"/>
         </w:rPr>
-        <w:t>F</w:t>
-      </w:r>
-      <w:r>
-        <w:rPr>
-          <w:b/>
-          <w:bCs/>
-          <w:i/>
-          <w:iCs/>
-          <w:sz w:val="24"/>
-          <w:szCs w:val="24"/>
-          <w:shd w:fill="333333" w:val="clear"/>
-        </w:rPr>
-        <w:t xml:space="preserve">eatures </w:t>
+        <w:t xml:space="preserve">Features </w:t>
       </w:r>
       <w:r>
         <w:rPr>
@@ -15440,16 +15428,15 @@
           <w:u w:val="none"/>
           <w:lang w:val="en-US" w:eastAsia="zh-CN" w:bidi="hi-IN"/>
         </w:rPr>
-        <w:t>()</w:t>
-        <w:tab/>
+        <w:t>list</w:t>
       </w:r>
       <w:r>
         <w:rPr>
           <w:rFonts w:eastAsia="Songti SC" w:cs="Arial Unicode MS" w:ascii="Georgia" w:hAnsi="Georgia"/>
           <w:b w:val="false"/>
           <w:bCs w:val="false"/>
-          <w:i w:val="false"/>
-          <w:iCs w:val="false"/>
+          <w:i/>
+          <w:iCs/>
           <w:color w:val="auto"/>
           <w:kern w:val="2"/>
           <w:sz w:val="14"/>
@@ -15457,21 +15444,15 @@
           <w:u w:val="none"/>
           <w:lang w:val="en-US" w:eastAsia="zh-CN" w:bidi="hi-IN"/>
         </w:rPr>
-        <w:t>heap info to</w:t>
-      </w:r>
-    </w:p>
-    <w:p>
-      <w:pPr>
-        <w:pStyle w:val="Normal"/>
-        <w:rPr/>
-      </w:pPr>
+        <w:tab/>
+      </w:r>
       <w:r>
         <w:rPr>
           <w:rFonts w:eastAsia="Songti SC" w:cs="Arial Unicode MS" w:ascii="Georgia" w:hAnsi="Georgia"/>
           <w:b w:val="false"/>
           <w:bCs w:val="false"/>
-          <w:i w:val="false"/>
-          <w:iCs w:val="false"/>
+          <w:i/>
+          <w:iCs/>
           <w:color w:val="auto"/>
           <w:kern w:val="2"/>
           <w:sz w:val="14"/>
@@ -15479,12 +15460,39 @@
           <w:u w:val="none"/>
           <w:lang w:val="en-US" w:eastAsia="zh-CN" w:bidi="hi-IN"/>
         </w:rPr>
-        <w:tab/>
-        <w:tab/>
-        <w:tab/>
-        <w:tab/>
-        <w:tab/>
-        <w:t>stdout</w:t>
+        <w:t xml:space="preserve">list </w:t>
+      </w:r>
+      <w:r>
+        <w:rPr>
+          <w:rFonts w:eastAsia="Songti SC" w:cs="Arial Unicode MS" w:ascii="Georgia" w:hAnsi="Georgia"/>
+          <w:b w:val="false"/>
+          <w:bCs w:val="false"/>
+          <w:i w:val="false"/>
+          <w:iCs w:val="false"/>
+          <w:color w:val="auto"/>
+          <w:kern w:val="2"/>
+          <w:sz w:val="14"/>
+          <w:szCs w:val="14"/>
+          <w:u w:val="none"/>
+          <w:lang w:val="en-US" w:eastAsia="zh-CN" w:bidi="hi-IN"/>
+        </w:rPr>
+        <w:t xml:space="preserve">of </w:t>
+      </w:r>
+      <w:r>
+        <w:rPr>
+          <w:rFonts w:eastAsia="Songti SC" w:cs="Arial Unicode MS" w:ascii="Georgia" w:hAnsi="Georgia"/>
+          <w:b w:val="false"/>
+          <w:bCs w:val="false"/>
+          <w:i w:val="false"/>
+          <w:iCs w:val="false"/>
+          <w:color w:val="auto"/>
+          <w:kern w:val="2"/>
+          <w:sz w:val="14"/>
+          <w:szCs w:val="14"/>
+          <w:u w:val="none"/>
+          <w:lang w:val="en-US" w:eastAsia="zh-CN" w:bidi="hi-IN"/>
+        </w:rPr>
+        <w:t>heap info</w:t>
       </w:r>
     </w:p>
     <w:p>
@@ -16093,19 +16101,43 @@
           <w:sz w:val="14"/>
           <w:szCs w:val="14"/>
         </w:rPr>
-        <w:t xml:space="preserve">   </w:t>
-      </w:r>
-      <w:r>
-        <w:rPr>
-          <w:rFonts w:ascii="Georgia" w:hAnsi="Georgia"/>
-          <w:b/>
-          <w:bCs/>
-          <w:i/>
-          <w:iCs/>
-          <w:sz w:val="16"/>
-          <w:szCs w:val="16"/>
-        </w:rPr>
-        <w:t>feature</w:t>
+        <w:t xml:space="preserve">  </w:t>
+      </w:r>
+      <w:r>
+        <w:rPr>
+          <w:rFonts w:ascii="Georgia" w:hAnsi="Georgia"/>
+          <w:b w:val="false"/>
+          <w:bCs w:val="false"/>
+          <w:i w:val="false"/>
+          <w:iCs w:val="false"/>
+          <w:sz w:val="14"/>
+          <w:szCs w:val="14"/>
+        </w:rPr>
+        <w:t xml:space="preserve"> </w:t>
+      </w:r>
+      <w:r>
+        <w:rPr>
+          <w:rFonts w:ascii="Georgia" w:hAnsi="Georgia"/>
+          <w:b/>
+          <w:bCs/>
+          <w:i w:val="false"/>
+          <w:iCs w:val="false"/>
+          <w:sz w:val="16"/>
+          <w:szCs w:val="16"/>
+        </w:rPr>
+        <w:t>f</w:t>
+      </w:r>
+      <w:r>
+        <w:rPr>
+          <w:rFonts w:ascii="Georgia" w:hAnsi="Georgia"/>
+          <w:b/>
+          <w:bCs/>
+          <w:i/>
+          <w:iCs/>
+          <w:sz w:val="16"/>
+          <w:szCs w:val="16"/>
+        </w:rPr>
+        <w:t>eature</w:t>
       </w:r>
       <w:r>
         <w:rPr>
@@ -16460,572 +16492,548 @@
           <w:sz w:val="16"/>
           <w:szCs w:val="16"/>
         </w:rPr>
-        <w:t>feature/</w:t>
-      </w:r>
-      <w:r>
-        <w:rPr>
-          <w:rFonts w:ascii="Georgia" w:hAnsi="Georgia"/>
-          <w:b/>
-          <w:bCs/>
-          <w:i w:val="false"/>
-          <w:iCs w:val="false"/>
-          <w:sz w:val="16"/>
-          <w:szCs w:val="16"/>
+        <w:t>feature/socket</w:t>
+        <w:tab/>
+      </w:r>
+      <w:r>
+        <w:rPr>
+          <w:rFonts w:ascii="Georgia" w:hAnsi="Georgia"/>
+          <w:b/>
+          <w:bCs/>
+          <w:i w:val="false"/>
+          <w:iCs w:val="false"/>
+          <w:sz w:val="14"/>
+          <w:szCs w:val="14"/>
+        </w:rPr>
+        <w:t>accept</w:t>
+      </w:r>
+    </w:p>
+    <w:p>
+      <w:pPr>
+        <w:pStyle w:val="Normal"/>
+        <w:rPr>
+          <w:rFonts w:ascii="Georgia" w:hAnsi="Georgia"/>
+          <w:b w:val="false"/>
+          <w:bCs w:val="false"/>
+          <w:sz w:val="14"/>
+          <w:szCs w:val="14"/>
+        </w:rPr>
+      </w:pPr>
+      <w:r>
+        <w:rPr>
+          <w:rFonts w:ascii="Georgia" w:hAnsi="Georgia"/>
+          <w:b w:val="false"/>
+          <w:bCs w:val="false"/>
+          <w:i w:val="false"/>
+          <w:iCs w:val="false"/>
+          <w:sz w:val="14"/>
+          <w:szCs w:val="14"/>
+        </w:rPr>
+        <w:tab/>
+        <w:tab/>
+      </w:r>
+      <w:r>
+        <w:rPr>
+          <w:rFonts w:ascii="Georgia" w:hAnsi="Georgia"/>
+          <w:b/>
+          <w:bCs/>
+          <w:i w:val="false"/>
+          <w:iCs w:val="false"/>
+          <w:sz w:val="14"/>
+          <w:szCs w:val="14"/>
+        </w:rPr>
+        <w:t>bind</w:t>
+      </w:r>
+    </w:p>
+    <w:p>
+      <w:pPr>
+        <w:pStyle w:val="Normal"/>
+        <w:rPr>
+          <w:rFonts w:ascii="Georgia" w:hAnsi="Georgia"/>
+          <w:b w:val="false"/>
+          <w:bCs w:val="false"/>
+          <w:sz w:val="14"/>
+          <w:szCs w:val="14"/>
+        </w:rPr>
+      </w:pPr>
+      <w:r>
+        <w:rPr>
+          <w:rFonts w:ascii="Georgia" w:hAnsi="Georgia"/>
+          <w:b w:val="false"/>
+          <w:bCs w:val="false"/>
+          <w:i w:val="false"/>
+          <w:iCs w:val="false"/>
+          <w:sz w:val="14"/>
+          <w:szCs w:val="14"/>
+        </w:rPr>
+        <w:tab/>
+        <w:tab/>
+      </w:r>
+      <w:r>
+        <w:rPr>
+          <w:rFonts w:ascii="Georgia" w:hAnsi="Georgia"/>
+          <w:b/>
+          <w:bCs/>
+          <w:i w:val="false"/>
+          <w:iCs w:val="false"/>
+          <w:sz w:val="14"/>
+          <w:szCs w:val="14"/>
+        </w:rPr>
+        <w:t>connect</w:t>
+      </w:r>
+    </w:p>
+    <w:p>
+      <w:pPr>
+        <w:pStyle w:val="Normal"/>
+        <w:rPr>
+          <w:rFonts w:ascii="Georgia" w:hAnsi="Georgia"/>
+          <w:b w:val="false"/>
+          <w:bCs w:val="false"/>
+          <w:sz w:val="14"/>
+          <w:szCs w:val="14"/>
+        </w:rPr>
+      </w:pPr>
+      <w:r>
+        <w:rPr>
+          <w:rFonts w:ascii="Georgia" w:hAnsi="Georgia"/>
+          <w:b w:val="false"/>
+          <w:bCs w:val="false"/>
+          <w:i w:val="false"/>
+          <w:iCs w:val="false"/>
+          <w:sz w:val="14"/>
+          <w:szCs w:val="14"/>
+        </w:rPr>
+        <w:tab/>
+        <w:tab/>
+      </w:r>
+      <w:r>
+        <w:rPr>
+          <w:rFonts w:ascii="Georgia" w:hAnsi="Georgia"/>
+          <w:b/>
+          <w:bCs/>
+          <w:i w:val="false"/>
+          <w:iCs w:val="false"/>
+          <w:sz w:val="14"/>
+          <w:szCs w:val="14"/>
+        </w:rPr>
+        <w:t>getpeername</w:t>
+      </w:r>
+    </w:p>
+    <w:p>
+      <w:pPr>
+        <w:pStyle w:val="Normal"/>
+        <w:rPr>
+          <w:rFonts w:ascii="Georgia" w:hAnsi="Georgia"/>
+          <w:b w:val="false"/>
+          <w:bCs w:val="false"/>
+          <w:sz w:val="14"/>
+          <w:szCs w:val="14"/>
+        </w:rPr>
+      </w:pPr>
+      <w:r>
+        <w:rPr>
+          <w:rFonts w:ascii="Georgia" w:hAnsi="Georgia"/>
+          <w:b w:val="false"/>
+          <w:bCs w:val="false"/>
+          <w:i w:val="false"/>
+          <w:iCs w:val="false"/>
+          <w:sz w:val="14"/>
+          <w:szCs w:val="14"/>
+        </w:rPr>
+        <w:tab/>
+        <w:tab/>
+      </w:r>
+      <w:r>
+        <w:rPr>
+          <w:rFonts w:ascii="Georgia" w:hAnsi="Georgia"/>
+          <w:b/>
+          <w:bCs/>
+          <w:i w:val="false"/>
+          <w:iCs w:val="false"/>
+          <w:sz w:val="14"/>
+          <w:szCs w:val="14"/>
+        </w:rPr>
+        <w:t>getsockname</w:t>
+      </w:r>
+    </w:p>
+    <w:p>
+      <w:pPr>
+        <w:pStyle w:val="Normal"/>
+        <w:rPr>
+          <w:rFonts w:ascii="Georgia" w:hAnsi="Georgia"/>
+          <w:b w:val="false"/>
+          <w:bCs w:val="false"/>
+          <w:sz w:val="14"/>
+          <w:szCs w:val="14"/>
+        </w:rPr>
+      </w:pPr>
+      <w:r>
+        <w:rPr>
+          <w:rFonts w:ascii="Georgia" w:hAnsi="Georgia"/>
+          <w:b w:val="false"/>
+          <w:bCs w:val="false"/>
+          <w:i w:val="false"/>
+          <w:iCs w:val="false"/>
+          <w:sz w:val="14"/>
+          <w:szCs w:val="14"/>
+        </w:rPr>
+        <w:tab/>
+        <w:tab/>
+      </w:r>
+      <w:r>
+        <w:rPr>
+          <w:rFonts w:ascii="Georgia" w:hAnsi="Georgia"/>
+          <w:b/>
+          <w:bCs/>
+          <w:i w:val="false"/>
+          <w:iCs w:val="false"/>
+          <w:sz w:val="14"/>
+          <w:szCs w:val="14"/>
+        </w:rPr>
+        <w:t>getsockopt</w:t>
+      </w:r>
+    </w:p>
+    <w:p>
+      <w:pPr>
+        <w:pStyle w:val="Normal"/>
+        <w:rPr>
+          <w:rFonts w:ascii="Georgia" w:hAnsi="Georgia"/>
+          <w:b w:val="false"/>
+          <w:bCs w:val="false"/>
+          <w:sz w:val="14"/>
+          <w:szCs w:val="14"/>
+        </w:rPr>
+      </w:pPr>
+      <w:r>
+        <w:rPr>
+          <w:rFonts w:ascii="Georgia" w:hAnsi="Georgia"/>
+          <w:b w:val="false"/>
+          <w:bCs w:val="false"/>
+          <w:i w:val="false"/>
+          <w:iCs w:val="false"/>
+          <w:sz w:val="14"/>
+          <w:szCs w:val="14"/>
+        </w:rPr>
+        <w:t xml:space="preserve"> </w:t>
+      </w:r>
+      <w:r>
+        <w:rPr>
+          <w:rFonts w:ascii="Georgia" w:hAnsi="Georgia"/>
+          <w:b w:val="false"/>
+          <w:bCs w:val="false"/>
+          <w:i w:val="false"/>
+          <w:iCs w:val="false"/>
+          <w:sz w:val="14"/>
+          <w:szCs w:val="14"/>
+        </w:rPr>
+        <w:tab/>
+        <w:tab/>
+      </w:r>
+      <w:r>
+        <w:rPr>
+          <w:rFonts w:ascii="Georgia" w:hAnsi="Georgia"/>
+          <w:b/>
+          <w:bCs/>
+          <w:i w:val="false"/>
+          <w:iCs w:val="false"/>
+          <w:sz w:val="14"/>
+          <w:szCs w:val="14"/>
+        </w:rPr>
+        <w:t>listen</w:t>
+      </w:r>
+    </w:p>
+    <w:p>
+      <w:pPr>
+        <w:pStyle w:val="Normal"/>
+        <w:rPr>
+          <w:rFonts w:ascii="Georgia" w:hAnsi="Georgia"/>
+          <w:b w:val="false"/>
+          <w:bCs w:val="false"/>
+          <w:sz w:val="14"/>
+          <w:szCs w:val="14"/>
+        </w:rPr>
+      </w:pPr>
+      <w:r>
+        <w:rPr>
+          <w:rFonts w:ascii="Georgia" w:hAnsi="Georgia"/>
+          <w:b w:val="false"/>
+          <w:bCs w:val="false"/>
+          <w:i w:val="false"/>
+          <w:iCs w:val="false"/>
+          <w:sz w:val="14"/>
+          <w:szCs w:val="14"/>
+        </w:rPr>
+        <w:t xml:space="preserve"> </w:t>
+      </w:r>
+      <w:r>
+        <w:rPr>
+          <w:rFonts w:ascii="Georgia" w:hAnsi="Georgia"/>
+          <w:b w:val="false"/>
+          <w:bCs w:val="false"/>
+          <w:i w:val="false"/>
+          <w:iCs w:val="false"/>
+          <w:sz w:val="14"/>
+          <w:szCs w:val="14"/>
+        </w:rPr>
+        <w:tab/>
+        <w:tab/>
+      </w:r>
+      <w:r>
+        <w:rPr>
+          <w:rFonts w:ascii="Georgia" w:hAnsi="Georgia"/>
+          <w:b/>
+          <w:bCs/>
+          <w:i w:val="false"/>
+          <w:iCs w:val="false"/>
+          <w:sz w:val="14"/>
+          <w:szCs w:val="14"/>
+        </w:rPr>
+        <w:t>read</w:t>
+      </w:r>
+    </w:p>
+    <w:p>
+      <w:pPr>
+        <w:pStyle w:val="Normal"/>
+        <w:rPr>
+          <w:rFonts w:ascii="Georgia" w:hAnsi="Georgia"/>
+          <w:b w:val="false"/>
+          <w:bCs w:val="false"/>
+          <w:sz w:val="14"/>
+          <w:szCs w:val="14"/>
+        </w:rPr>
+      </w:pPr>
+      <w:r>
+        <w:rPr>
+          <w:rFonts w:ascii="Georgia" w:hAnsi="Georgia"/>
+          <w:b w:val="false"/>
+          <w:bCs w:val="false"/>
+          <w:i w:val="false"/>
+          <w:iCs w:val="false"/>
+          <w:sz w:val="14"/>
+          <w:szCs w:val="14"/>
+        </w:rPr>
+        <w:t xml:space="preserve"> </w:t>
+      </w:r>
+      <w:r>
+        <w:rPr>
+          <w:rFonts w:ascii="Georgia" w:hAnsi="Georgia"/>
+          <w:b w:val="false"/>
+          <w:bCs w:val="false"/>
+          <w:i w:val="false"/>
+          <w:iCs w:val="false"/>
+          <w:sz w:val="14"/>
+          <w:szCs w:val="14"/>
+        </w:rPr>
+        <w:tab/>
+        <w:tab/>
+      </w:r>
+      <w:r>
+        <w:rPr>
+          <w:rFonts w:ascii="Georgia" w:hAnsi="Georgia"/>
+          <w:b/>
+          <w:bCs/>
+          <w:i w:val="false"/>
+          <w:iCs w:val="false"/>
+          <w:sz w:val="14"/>
+          <w:szCs w:val="14"/>
+        </w:rPr>
+        <w:t>recv</w:t>
+      </w:r>
+    </w:p>
+    <w:p>
+      <w:pPr>
+        <w:pStyle w:val="Normal"/>
+        <w:rPr>
+          <w:rFonts w:ascii="Georgia" w:hAnsi="Georgia"/>
+          <w:b w:val="false"/>
+          <w:bCs w:val="false"/>
+          <w:sz w:val="14"/>
+          <w:szCs w:val="14"/>
+        </w:rPr>
+      </w:pPr>
+      <w:r>
+        <w:rPr>
+          <w:rFonts w:ascii="Georgia" w:hAnsi="Georgia"/>
+          <w:b w:val="false"/>
+          <w:bCs w:val="false"/>
+          <w:i w:val="false"/>
+          <w:iCs w:val="false"/>
+          <w:sz w:val="14"/>
+          <w:szCs w:val="14"/>
+        </w:rPr>
+        <w:t xml:space="preserve"> </w:t>
+      </w:r>
+      <w:r>
+        <w:rPr>
+          <w:rFonts w:ascii="Georgia" w:hAnsi="Georgia"/>
+          <w:b w:val="false"/>
+          <w:bCs w:val="false"/>
+          <w:i w:val="false"/>
+          <w:iCs w:val="false"/>
+          <w:sz w:val="14"/>
+          <w:szCs w:val="14"/>
+        </w:rPr>
+        <w:tab/>
+        <w:tab/>
+      </w:r>
+      <w:r>
+        <w:rPr>
+          <w:rFonts w:ascii="Georgia" w:hAnsi="Georgia"/>
+          <w:b/>
+          <w:bCs/>
+          <w:i w:val="false"/>
+          <w:iCs w:val="false"/>
+          <w:sz w:val="14"/>
+          <w:szCs w:val="14"/>
+        </w:rPr>
+        <w:t>select</w:t>
+      </w:r>
+    </w:p>
+    <w:p>
+      <w:pPr>
+        <w:pStyle w:val="Normal"/>
+        <w:rPr>
+          <w:rFonts w:ascii="Georgia" w:hAnsi="Georgia"/>
+          <w:b w:val="false"/>
+          <w:bCs w:val="false"/>
+          <w:sz w:val="14"/>
+          <w:szCs w:val="14"/>
+        </w:rPr>
+      </w:pPr>
+      <w:r>
+        <w:rPr>
+          <w:rFonts w:ascii="Georgia" w:hAnsi="Georgia"/>
+          <w:b w:val="false"/>
+          <w:bCs w:val="false"/>
+          <w:i w:val="false"/>
+          <w:iCs w:val="false"/>
+          <w:sz w:val="14"/>
+          <w:szCs w:val="14"/>
+        </w:rPr>
+        <w:t xml:space="preserve"> </w:t>
+      </w:r>
+      <w:r>
+        <w:rPr>
+          <w:rFonts w:ascii="Georgia" w:hAnsi="Georgia"/>
+          <w:b w:val="false"/>
+          <w:bCs w:val="false"/>
+          <w:i w:val="false"/>
+          <w:iCs w:val="false"/>
+          <w:sz w:val="14"/>
+          <w:szCs w:val="14"/>
+        </w:rPr>
+        <w:tab/>
+        <w:tab/>
+      </w:r>
+      <w:r>
+        <w:rPr>
+          <w:rFonts w:ascii="Georgia" w:hAnsi="Georgia"/>
+          <w:b/>
+          <w:bCs/>
+          <w:i w:val="false"/>
+          <w:iCs w:val="false"/>
+          <w:sz w:val="14"/>
+          <w:szCs w:val="14"/>
+        </w:rPr>
+        <w:t>send</w:t>
+      </w:r>
+    </w:p>
+    <w:p>
+      <w:pPr>
+        <w:pStyle w:val="Normal"/>
+        <w:rPr>
+          <w:rFonts w:ascii="Georgia" w:hAnsi="Georgia"/>
+          <w:b w:val="false"/>
+          <w:bCs w:val="false"/>
+          <w:sz w:val="14"/>
+          <w:szCs w:val="14"/>
+        </w:rPr>
+      </w:pPr>
+      <w:r>
+        <w:rPr>
+          <w:rFonts w:ascii="Georgia" w:hAnsi="Georgia"/>
+          <w:b w:val="false"/>
+          <w:bCs w:val="false"/>
+          <w:i w:val="false"/>
+          <w:iCs w:val="false"/>
+          <w:sz w:val="14"/>
+          <w:szCs w:val="14"/>
+        </w:rPr>
+        <w:t xml:space="preserve"> </w:t>
+      </w:r>
+      <w:r>
+        <w:rPr>
+          <w:rFonts w:ascii="Georgia" w:hAnsi="Georgia"/>
+          <w:b w:val="false"/>
+          <w:bCs w:val="false"/>
+          <w:i w:val="false"/>
+          <w:iCs w:val="false"/>
+          <w:sz w:val="14"/>
+          <w:szCs w:val="14"/>
+        </w:rPr>
+        <w:tab/>
+        <w:tab/>
+      </w:r>
+      <w:r>
+        <w:rPr>
+          <w:rFonts w:ascii="Georgia" w:hAnsi="Georgia"/>
+          <w:b/>
+          <w:bCs/>
+          <w:i w:val="false"/>
+          <w:iCs w:val="false"/>
+          <w:sz w:val="14"/>
+          <w:szCs w:val="14"/>
+        </w:rPr>
+        <w:t>shutdown</w:t>
+      </w:r>
+    </w:p>
+    <w:p>
+      <w:pPr>
+        <w:pStyle w:val="Normal"/>
+        <w:rPr>
+          <w:rFonts w:ascii="Georgia" w:hAnsi="Georgia"/>
+          <w:b w:val="false"/>
+          <w:bCs w:val="false"/>
+          <w:sz w:val="14"/>
+          <w:szCs w:val="14"/>
+        </w:rPr>
+      </w:pPr>
+      <w:r>
+        <w:rPr>
+          <w:rFonts w:ascii="Georgia" w:hAnsi="Georgia"/>
+          <w:b w:val="false"/>
+          <w:bCs w:val="false"/>
+          <w:i w:val="false"/>
+          <w:iCs w:val="false"/>
+          <w:sz w:val="14"/>
+          <w:szCs w:val="14"/>
+        </w:rPr>
+        <w:t xml:space="preserve"> </w:t>
+      </w:r>
+      <w:r>
+        <w:rPr>
+          <w:rFonts w:ascii="Georgia" w:hAnsi="Georgia"/>
+          <w:b w:val="false"/>
+          <w:bCs w:val="false"/>
+          <w:i w:val="false"/>
+          <w:iCs w:val="false"/>
+          <w:sz w:val="14"/>
+          <w:szCs w:val="14"/>
+        </w:rPr>
+        <w:tab/>
+        <w:tab/>
+      </w:r>
+      <w:r>
+        <w:rPr>
+          <w:rFonts w:ascii="Georgia" w:hAnsi="Georgia"/>
+          <w:b/>
+          <w:bCs/>
+          <w:i w:val="false"/>
+          <w:iCs w:val="false"/>
+          <w:sz w:val="14"/>
+          <w:szCs w:val="14"/>
         </w:rPr>
         <w:t>socket</w:t>
-        <w:tab/>
-      </w:r>
-      <w:r>
-        <w:rPr>
-          <w:rFonts w:ascii="Georgia" w:hAnsi="Georgia"/>
-          <w:b/>
-          <w:bCs/>
-          <w:i w:val="false"/>
-          <w:iCs w:val="false"/>
-          <w:sz w:val="14"/>
-          <w:szCs w:val="14"/>
-        </w:rPr>
-        <w:t>accept</w:t>
-      </w:r>
-    </w:p>
-    <w:p>
-      <w:pPr>
-        <w:pStyle w:val="Normal"/>
-        <w:rPr>
-          <w:rFonts w:ascii="Georgia" w:hAnsi="Georgia"/>
-          <w:b w:val="false"/>
-          <w:bCs w:val="false"/>
-          <w:sz w:val="14"/>
-          <w:szCs w:val="14"/>
-        </w:rPr>
-      </w:pPr>
-      <w:r>
-        <w:rPr>
-          <w:rFonts w:ascii="Georgia" w:hAnsi="Georgia"/>
-          <w:b w:val="false"/>
-          <w:bCs w:val="false"/>
-          <w:i w:val="false"/>
-          <w:iCs w:val="false"/>
-          <w:sz w:val="14"/>
-          <w:szCs w:val="14"/>
-        </w:rPr>
-        <w:tab/>
-        <w:tab/>
-      </w:r>
-      <w:r>
-        <w:rPr>
-          <w:rFonts w:ascii="Georgia" w:hAnsi="Georgia"/>
-          <w:b/>
-          <w:bCs/>
-          <w:i w:val="false"/>
-          <w:iCs w:val="false"/>
-          <w:sz w:val="14"/>
-          <w:szCs w:val="14"/>
-        </w:rPr>
-        <w:t>bind</w:t>
-      </w:r>
-    </w:p>
-    <w:p>
-      <w:pPr>
-        <w:pStyle w:val="Normal"/>
-        <w:rPr>
-          <w:rFonts w:ascii="Georgia" w:hAnsi="Georgia"/>
-          <w:b w:val="false"/>
-          <w:bCs w:val="false"/>
-          <w:sz w:val="14"/>
-          <w:szCs w:val="14"/>
-        </w:rPr>
-      </w:pPr>
-      <w:r>
-        <w:rPr>
-          <w:rFonts w:ascii="Georgia" w:hAnsi="Georgia"/>
-          <w:b w:val="false"/>
-          <w:bCs w:val="false"/>
-          <w:i w:val="false"/>
-          <w:iCs w:val="false"/>
-          <w:sz w:val="14"/>
-          <w:szCs w:val="14"/>
-        </w:rPr>
-        <w:tab/>
-        <w:tab/>
-      </w:r>
-      <w:r>
-        <w:rPr>
-          <w:rFonts w:ascii="Georgia" w:hAnsi="Georgia"/>
-          <w:b/>
-          <w:bCs/>
-          <w:i w:val="false"/>
-          <w:iCs w:val="false"/>
-          <w:sz w:val="14"/>
-          <w:szCs w:val="14"/>
-        </w:rPr>
-        <w:t>connect</w:t>
-      </w:r>
-    </w:p>
-    <w:p>
-      <w:pPr>
-        <w:pStyle w:val="Normal"/>
-        <w:rPr>
-          <w:rFonts w:ascii="Georgia" w:hAnsi="Georgia"/>
-          <w:b w:val="false"/>
-          <w:bCs w:val="false"/>
-          <w:sz w:val="14"/>
-          <w:szCs w:val="14"/>
-        </w:rPr>
-      </w:pPr>
-      <w:r>
-        <w:rPr>
-          <w:rFonts w:ascii="Georgia" w:hAnsi="Georgia"/>
-          <w:b w:val="false"/>
-          <w:bCs w:val="false"/>
-          <w:i w:val="false"/>
-          <w:iCs w:val="false"/>
-          <w:sz w:val="14"/>
-          <w:szCs w:val="14"/>
-        </w:rPr>
-        <w:tab/>
-        <w:tab/>
-      </w:r>
-      <w:r>
-        <w:rPr>
-          <w:rFonts w:ascii="Georgia" w:hAnsi="Georgia"/>
-          <w:b/>
-          <w:bCs/>
-          <w:i w:val="false"/>
-          <w:iCs w:val="false"/>
-          <w:sz w:val="14"/>
-          <w:szCs w:val="14"/>
-        </w:rPr>
-        <w:t>getpeername</w:t>
-      </w:r>
-    </w:p>
-    <w:p>
-      <w:pPr>
-        <w:pStyle w:val="Normal"/>
-        <w:rPr>
-          <w:rFonts w:ascii="Georgia" w:hAnsi="Georgia"/>
-          <w:b w:val="false"/>
-          <w:bCs w:val="false"/>
-          <w:sz w:val="14"/>
-          <w:szCs w:val="14"/>
-        </w:rPr>
-      </w:pPr>
-      <w:r>
-        <w:rPr>
-          <w:rFonts w:ascii="Georgia" w:hAnsi="Georgia"/>
-          <w:b w:val="false"/>
-          <w:bCs w:val="false"/>
-          <w:i w:val="false"/>
-          <w:iCs w:val="false"/>
-          <w:sz w:val="14"/>
-          <w:szCs w:val="14"/>
-        </w:rPr>
-        <w:tab/>
-        <w:tab/>
-      </w:r>
-      <w:r>
-        <w:rPr>
-          <w:rFonts w:ascii="Georgia" w:hAnsi="Georgia"/>
-          <w:b/>
-          <w:bCs/>
-          <w:i w:val="false"/>
-          <w:iCs w:val="false"/>
-          <w:sz w:val="14"/>
-          <w:szCs w:val="14"/>
-        </w:rPr>
-        <w:t>getsockname</w:t>
-      </w:r>
-    </w:p>
-    <w:p>
-      <w:pPr>
-        <w:pStyle w:val="Normal"/>
-        <w:rPr>
-          <w:rFonts w:ascii="Georgia" w:hAnsi="Georgia"/>
-          <w:b w:val="false"/>
-          <w:bCs w:val="false"/>
-          <w:sz w:val="14"/>
-          <w:szCs w:val="14"/>
-        </w:rPr>
-      </w:pPr>
-      <w:r>
-        <w:rPr>
-          <w:rFonts w:ascii="Georgia" w:hAnsi="Georgia"/>
-          <w:b w:val="false"/>
-          <w:bCs w:val="false"/>
-          <w:i w:val="false"/>
-          <w:iCs w:val="false"/>
-          <w:sz w:val="14"/>
-          <w:szCs w:val="14"/>
-        </w:rPr>
-        <w:tab/>
-        <w:tab/>
-      </w:r>
-      <w:r>
-        <w:rPr>
-          <w:rFonts w:ascii="Georgia" w:hAnsi="Georgia"/>
-          <w:b/>
-          <w:bCs/>
-          <w:i w:val="false"/>
-          <w:iCs w:val="false"/>
-          <w:sz w:val="14"/>
-          <w:szCs w:val="14"/>
-        </w:rPr>
-        <w:t>getsockopt</w:t>
-      </w:r>
-    </w:p>
-    <w:p>
-      <w:pPr>
-        <w:pStyle w:val="Normal"/>
-        <w:rPr>
-          <w:rFonts w:ascii="Georgia" w:hAnsi="Georgia"/>
-          <w:b w:val="false"/>
-          <w:bCs w:val="false"/>
-          <w:sz w:val="14"/>
-          <w:szCs w:val="14"/>
-        </w:rPr>
-      </w:pPr>
-      <w:r>
-        <w:rPr>
-          <w:rFonts w:ascii="Georgia" w:hAnsi="Georgia"/>
-          <w:b w:val="false"/>
-          <w:bCs w:val="false"/>
-          <w:i w:val="false"/>
-          <w:iCs w:val="false"/>
-          <w:sz w:val="14"/>
-          <w:szCs w:val="14"/>
-        </w:rPr>
-        <w:t xml:space="preserve"> </w:t>
-      </w:r>
-      <w:r>
-        <w:rPr>
-          <w:rFonts w:ascii="Georgia" w:hAnsi="Georgia"/>
-          <w:b w:val="false"/>
-          <w:bCs w:val="false"/>
-          <w:i w:val="false"/>
-          <w:iCs w:val="false"/>
-          <w:sz w:val="14"/>
-          <w:szCs w:val="14"/>
-        </w:rPr>
-        <w:tab/>
-        <w:tab/>
-      </w:r>
-      <w:r>
-        <w:rPr>
-          <w:rFonts w:ascii="Georgia" w:hAnsi="Georgia"/>
-          <w:b/>
-          <w:bCs/>
-          <w:i w:val="false"/>
-          <w:iCs w:val="false"/>
-          <w:sz w:val="14"/>
-          <w:szCs w:val="14"/>
-        </w:rPr>
-        <w:t>listen</w:t>
-      </w:r>
-    </w:p>
-    <w:p>
-      <w:pPr>
-        <w:pStyle w:val="Normal"/>
-        <w:rPr>
-          <w:rFonts w:ascii="Georgia" w:hAnsi="Georgia"/>
-          <w:b w:val="false"/>
-          <w:bCs w:val="false"/>
-          <w:sz w:val="14"/>
-          <w:szCs w:val="14"/>
-        </w:rPr>
-      </w:pPr>
-      <w:r>
-        <w:rPr>
-          <w:rFonts w:ascii="Georgia" w:hAnsi="Georgia"/>
-          <w:b w:val="false"/>
-          <w:bCs w:val="false"/>
-          <w:i w:val="false"/>
-          <w:iCs w:val="false"/>
-          <w:sz w:val="14"/>
-          <w:szCs w:val="14"/>
-        </w:rPr>
-        <w:t xml:space="preserve"> </w:t>
-      </w:r>
-      <w:r>
-        <w:rPr>
-          <w:rFonts w:ascii="Georgia" w:hAnsi="Georgia"/>
-          <w:b w:val="false"/>
-          <w:bCs w:val="false"/>
-          <w:i w:val="false"/>
-          <w:iCs w:val="false"/>
-          <w:sz w:val="14"/>
-          <w:szCs w:val="14"/>
-        </w:rPr>
-        <w:tab/>
-        <w:tab/>
-      </w:r>
-      <w:r>
-        <w:rPr>
-          <w:rFonts w:ascii="Georgia" w:hAnsi="Georgia"/>
-          <w:b/>
-          <w:bCs/>
-          <w:i w:val="false"/>
-          <w:iCs w:val="false"/>
-          <w:sz w:val="14"/>
-          <w:szCs w:val="14"/>
-        </w:rPr>
-        <w:t>read</w:t>
-      </w:r>
-    </w:p>
-    <w:p>
-      <w:pPr>
-        <w:pStyle w:val="Normal"/>
-        <w:rPr>
-          <w:rFonts w:ascii="Georgia" w:hAnsi="Georgia"/>
-          <w:b w:val="false"/>
-          <w:bCs w:val="false"/>
-          <w:sz w:val="14"/>
-          <w:szCs w:val="14"/>
-        </w:rPr>
-      </w:pPr>
-      <w:r>
-        <w:rPr>
-          <w:rFonts w:ascii="Georgia" w:hAnsi="Georgia"/>
-          <w:b w:val="false"/>
-          <w:bCs w:val="false"/>
-          <w:i w:val="false"/>
-          <w:iCs w:val="false"/>
-          <w:sz w:val="14"/>
-          <w:szCs w:val="14"/>
-        </w:rPr>
-        <w:t xml:space="preserve"> </w:t>
-      </w:r>
-      <w:r>
-        <w:rPr>
-          <w:rFonts w:ascii="Georgia" w:hAnsi="Georgia"/>
-          <w:b w:val="false"/>
-          <w:bCs w:val="false"/>
-          <w:i w:val="false"/>
-          <w:iCs w:val="false"/>
-          <w:sz w:val="14"/>
-          <w:szCs w:val="14"/>
-        </w:rPr>
-        <w:tab/>
-        <w:tab/>
-      </w:r>
-      <w:r>
-        <w:rPr>
-          <w:rFonts w:ascii="Georgia" w:hAnsi="Georgia"/>
-          <w:b/>
-          <w:bCs/>
-          <w:i w:val="false"/>
-          <w:iCs w:val="false"/>
-          <w:sz w:val="14"/>
-          <w:szCs w:val="14"/>
-        </w:rPr>
-        <w:t>recv</w:t>
-      </w:r>
-    </w:p>
-    <w:p>
-      <w:pPr>
-        <w:pStyle w:val="Normal"/>
-        <w:rPr>
-          <w:rFonts w:ascii="Georgia" w:hAnsi="Georgia"/>
-          <w:b w:val="false"/>
-          <w:bCs w:val="false"/>
-          <w:sz w:val="14"/>
-          <w:szCs w:val="14"/>
-        </w:rPr>
-      </w:pPr>
-      <w:r>
-        <w:rPr>
-          <w:rFonts w:ascii="Georgia" w:hAnsi="Georgia"/>
-          <w:b w:val="false"/>
-          <w:bCs w:val="false"/>
-          <w:i w:val="false"/>
-          <w:iCs w:val="false"/>
-          <w:sz w:val="14"/>
-          <w:szCs w:val="14"/>
-        </w:rPr>
-        <w:t xml:space="preserve"> </w:t>
-      </w:r>
-      <w:r>
-        <w:rPr>
-          <w:rFonts w:ascii="Georgia" w:hAnsi="Georgia"/>
-          <w:b w:val="false"/>
-          <w:bCs w:val="false"/>
-          <w:i w:val="false"/>
-          <w:iCs w:val="false"/>
-          <w:sz w:val="14"/>
-          <w:szCs w:val="14"/>
-        </w:rPr>
-        <w:tab/>
-        <w:tab/>
-      </w:r>
-      <w:r>
-        <w:rPr>
-          <w:rFonts w:ascii="Georgia" w:hAnsi="Georgia"/>
-          <w:b/>
-          <w:bCs/>
-          <w:i w:val="false"/>
-          <w:iCs w:val="false"/>
-          <w:sz w:val="14"/>
-          <w:szCs w:val="14"/>
-        </w:rPr>
-        <w:t>select</w:t>
-      </w:r>
-    </w:p>
-    <w:p>
-      <w:pPr>
-        <w:pStyle w:val="Normal"/>
-        <w:rPr>
-          <w:rFonts w:ascii="Georgia" w:hAnsi="Georgia"/>
-          <w:b w:val="false"/>
-          <w:bCs w:val="false"/>
-          <w:sz w:val="14"/>
-          <w:szCs w:val="14"/>
-        </w:rPr>
-      </w:pPr>
-      <w:r>
-        <w:rPr>
-          <w:rFonts w:ascii="Georgia" w:hAnsi="Georgia"/>
-          <w:b w:val="false"/>
-          <w:bCs w:val="false"/>
-          <w:i w:val="false"/>
-          <w:iCs w:val="false"/>
-          <w:sz w:val="14"/>
-          <w:szCs w:val="14"/>
-        </w:rPr>
-        <w:t xml:space="preserve"> </w:t>
-      </w:r>
-      <w:r>
-        <w:rPr>
-          <w:rFonts w:ascii="Georgia" w:hAnsi="Georgia"/>
-          <w:b w:val="false"/>
-          <w:bCs w:val="false"/>
-          <w:i w:val="false"/>
-          <w:iCs w:val="false"/>
-          <w:sz w:val="14"/>
-          <w:szCs w:val="14"/>
-        </w:rPr>
-        <w:tab/>
-        <w:tab/>
-      </w:r>
-      <w:r>
-        <w:rPr>
-          <w:rFonts w:ascii="Georgia" w:hAnsi="Georgia"/>
-          <w:b/>
-          <w:bCs/>
-          <w:i w:val="false"/>
-          <w:iCs w:val="false"/>
-          <w:sz w:val="14"/>
-          <w:szCs w:val="14"/>
-        </w:rPr>
-        <w:t>send</w:t>
-      </w:r>
-    </w:p>
-    <w:p>
-      <w:pPr>
-        <w:pStyle w:val="Normal"/>
-        <w:rPr>
-          <w:rFonts w:ascii="Georgia" w:hAnsi="Georgia"/>
-          <w:b w:val="false"/>
-          <w:bCs w:val="false"/>
-          <w:sz w:val="14"/>
-          <w:szCs w:val="14"/>
-        </w:rPr>
-      </w:pPr>
-      <w:r>
-        <w:rPr>
-          <w:rFonts w:ascii="Georgia" w:hAnsi="Georgia"/>
-          <w:b w:val="false"/>
-          <w:bCs w:val="false"/>
-          <w:i w:val="false"/>
-          <w:iCs w:val="false"/>
-          <w:sz w:val="14"/>
-          <w:szCs w:val="14"/>
-        </w:rPr>
-        <w:t xml:space="preserve"> </w:t>
-      </w:r>
-      <w:r>
-        <w:rPr>
-          <w:rFonts w:ascii="Georgia" w:hAnsi="Georgia"/>
-          <w:b w:val="false"/>
-          <w:bCs w:val="false"/>
-          <w:i w:val="false"/>
-          <w:iCs w:val="false"/>
-          <w:sz w:val="14"/>
-          <w:szCs w:val="14"/>
-        </w:rPr>
-        <w:tab/>
-        <w:tab/>
-      </w:r>
-      <w:r>
-        <w:rPr>
-          <w:rFonts w:ascii="Georgia" w:hAnsi="Georgia"/>
-          <w:b/>
-          <w:bCs/>
-          <w:i w:val="false"/>
-          <w:iCs w:val="false"/>
-          <w:sz w:val="14"/>
-          <w:szCs w:val="14"/>
-        </w:rPr>
-        <w:t>shutdow</w:t>
-      </w:r>
-      <w:r>
-        <w:rPr>
-          <w:rFonts w:ascii="Georgia" w:hAnsi="Georgia"/>
-          <w:b/>
-          <w:bCs/>
-          <w:i w:val="false"/>
-          <w:iCs w:val="false"/>
-          <w:sz w:val="14"/>
-          <w:szCs w:val="14"/>
-        </w:rPr>
-        <w:t>n</w:t>
-      </w:r>
-    </w:p>
-    <w:p>
-      <w:pPr>
-        <w:pStyle w:val="Normal"/>
-        <w:rPr>
-          <w:rFonts w:ascii="Georgia" w:hAnsi="Georgia"/>
-          <w:b w:val="false"/>
-          <w:bCs w:val="false"/>
-          <w:sz w:val="14"/>
-          <w:szCs w:val="14"/>
-        </w:rPr>
-      </w:pPr>
-      <w:r>
-        <w:rPr>
-          <w:rFonts w:ascii="Georgia" w:hAnsi="Georgia"/>
-          <w:b w:val="false"/>
-          <w:bCs w:val="false"/>
-          <w:i w:val="false"/>
-          <w:iCs w:val="false"/>
-          <w:sz w:val="14"/>
-          <w:szCs w:val="14"/>
-        </w:rPr>
-        <w:t xml:space="preserve"> </w:t>
-      </w:r>
-      <w:r>
-        <w:rPr>
-          <w:rFonts w:ascii="Georgia" w:hAnsi="Georgia"/>
-          <w:b w:val="false"/>
-          <w:bCs w:val="false"/>
-          <w:i w:val="false"/>
-          <w:iCs w:val="false"/>
-          <w:sz w:val="14"/>
-          <w:szCs w:val="14"/>
-        </w:rPr>
-        <w:tab/>
-        <w:tab/>
-      </w:r>
-      <w:r>
-        <w:rPr>
-          <w:rFonts w:ascii="Georgia" w:hAnsi="Georgia"/>
-          <w:b/>
-          <w:bCs/>
-          <w:i w:val="false"/>
-          <w:iCs w:val="false"/>
-          <w:sz w:val="14"/>
-          <w:szCs w:val="14"/>
-        </w:rPr>
-        <w:t>socket</w:t>
       </w:r>
     </w:p>
     <w:p>
@@ -17122,6 +17130,19 @@
           <w:szCs w:val="14"/>
         </w:rPr>
         <w:t>write</w:t>
+      </w:r>
+    </w:p>
+    <w:p>
+      <w:pPr>
+        <w:pStyle w:val="Normal"/>
+        <w:rPr>
+          <w:rFonts w:ascii="Georgia" w:hAnsi="Georgia"/>
+          <w:sz w:val="14"/>
+          <w:szCs w:val="14"/>
+        </w:rPr>
+      </w:pPr>
+      <w:r>
+        <w:rPr/>
       </w:r>
     </w:p>
     <w:p>
@@ -18809,17 +18830,7 @@
           <w:sz w:val="16"/>
           <w:szCs w:val="16"/>
         </w:rPr>
-        <w:t>reference</w:t>
-      </w:r>
-      <w:r>
-        <w:rPr>
-          <w:rFonts w:ascii="Georgia" w:hAnsi="Georgia"/>
-          <w:b w:val="false"/>
-          <w:bCs w:val="false"/>
-          <w:sz w:val="16"/>
-          <w:szCs w:val="16"/>
-        </w:rPr>
-        <w:t>:</w:t>
+        <w:t>reference:</w:t>
       </w:r>
     </w:p>
     <w:p>
@@ -18834,7 +18845,13 @@
         </w:rPr>
       </w:pPr>
       <w:r>
-        <w:rPr/>
+        <w:rPr>
+          <w:rFonts w:ascii="Georgia" w:hAnsi="Georgia"/>
+          <w:b/>
+          <w:bCs/>
+          <w:sz w:val="12"/>
+          <w:szCs w:val="12"/>
+        </w:rPr>
       </w:r>
     </w:p>
     <w:p>
@@ -23564,7 +23581,7 @@
     <w:pPr>
       <w:widowControl/>
       <w:suppressAutoHyphens w:val="true"/>
-      <w:overflowPunct w:val="true"/>
+      <w:overflowPunct w:val="false"/>
       <w:bidi w:val="0"/>
       <w:spacing w:before="0" w:after="0"/>
       <w:jc w:val="left"/>

</xml_diff>

<commit_message>
#1091 - module: describe.sys
</commit_message>
<xml_diff>
--- a/doc/refcards/mu-ref.docx
+++ b/doc/refcards/mu-ref.docx
@@ -64,7 +64,7 @@
           <w:tab w:val="left" w:pos="4110" w:leader="none"/>
         </w:tabs>
         <w:suppressAutoHyphens w:val="true"/>
-        <w:overflowPunct w:val="false"/>
+        <w:overflowPunct w:val="true"/>
         <w:bidi w:val="0"/>
         <w:spacing w:before="0" w:after="0"/>
         <w:ind w:hanging="0" w:left="0" w:right="0"/>
@@ -2161,7 +2161,7 @@
         <w:pStyle w:val="Normal"/>
         <w:widowControl/>
         <w:suppressAutoHyphens w:val="true"/>
-        <w:overflowPunct w:val="false"/>
+        <w:overflowPunct w:val="true"/>
         <w:bidi w:val="0"/>
         <w:spacing w:before="0" w:after="0"/>
         <w:ind w:hanging="0" w:left="0" w:right="0"/>
@@ -5562,7 +5562,7 @@
         <w:pStyle w:val="Normal"/>
         <w:widowControl/>
         <w:suppressAutoHyphens w:val="true"/>
-        <w:overflowPunct w:val="false"/>
+        <w:overflowPunct w:val="true"/>
         <w:bidi w:val="0"/>
         <w:spacing w:before="0" w:after="0"/>
         <w:ind w:hanging="0" w:left="0" w:right="0"/>
@@ -14788,6 +14788,72 @@
           <w:u w:val="none"/>
           <w:lang w:val="en-US" w:eastAsia="zh-CN" w:bidi="hi-IN"/>
         </w:rPr>
+        <w:t>core-</w:t>
+      </w:r>
+      <w:r>
+        <w:rPr>
+          <w:rFonts w:eastAsia="Songti SC" w:cs="Arial Unicode MS" w:ascii="Georgia" w:hAnsi="Georgia"/>
+          <w:b/>
+          <w:bCs/>
+          <w:i/>
+          <w:iCs/>
+          <w:color w:val="auto"/>
+          <w:kern w:val="2"/>
+          <w:sz w:val="14"/>
+          <w:szCs w:val="14"/>
+          <w:u w:val="none"/>
+          <w:lang w:val="en-US" w:eastAsia="zh-CN" w:bidi="hi-IN"/>
+        </w:rPr>
+        <w:t>info</w:t>
+      </w:r>
+      <w:r>
+        <w:rPr>
+          <w:rFonts w:eastAsia="Songti SC" w:cs="Arial Unicode MS" w:ascii="Georgia" w:hAnsi="Georgia"/>
+          <w:b w:val="false"/>
+          <w:bCs w:val="false"/>
+          <w:i w:val="false"/>
+          <w:iCs w:val="false"/>
+          <w:color w:val="auto"/>
+          <w:kern w:val="2"/>
+          <w:sz w:val="14"/>
+          <w:szCs w:val="14"/>
+          <w:u w:val="none"/>
+          <w:lang w:val="en-US" w:eastAsia="zh-CN" w:bidi="hi-IN"/>
+        </w:rPr>
+        <w:tab/>
+        <w:tab/>
+      </w:r>
+      <w:r>
+        <w:rPr>
+          <w:rFonts w:eastAsia="Songti SC" w:cs="Arial Unicode MS" w:ascii="Georgia" w:hAnsi="Georgia"/>
+          <w:b w:val="false"/>
+          <w:bCs w:val="false"/>
+          <w:i/>
+          <w:iCs/>
+          <w:color w:val="auto"/>
+          <w:kern w:val="2"/>
+          <w:sz w:val="14"/>
+          <w:szCs w:val="14"/>
+          <w:u w:val="none"/>
+          <w:lang w:val="en-US" w:eastAsia="zh-CN" w:bidi="hi-IN"/>
+        </w:rPr>
+        <w:t>list</w:t>
+        <w:tab/>
+      </w:r>
+      <w:r>
+        <w:rPr>
+          <w:rFonts w:eastAsia="Songti SC" w:cs="Arial Unicode MS" w:ascii="Georgia" w:hAnsi="Georgia"/>
+          <w:b w:val="false"/>
+          <w:bCs w:val="false"/>
+          <w:i w:val="false"/>
+          <w:iCs w:val="false"/>
+          <w:color w:val="auto"/>
+          <w:kern w:val="2"/>
+          <w:sz w:val="14"/>
+          <w:szCs w:val="14"/>
+          <w:u w:val="none"/>
+          <w:lang w:val="en-US" w:eastAsia="zh-CN" w:bidi="hi-IN"/>
+        </w:rPr>
         <w:t>core</w:t>
       </w:r>
       <w:r>
@@ -14795,8 +14861,8 @@
           <w:rFonts w:eastAsia="Songti SC" w:cs="Arial Unicode MS" w:ascii="Georgia" w:hAnsi="Georgia"/>
           <w:b w:val="false"/>
           <w:bCs w:val="false"/>
-          <w:i w:val="false"/>
-          <w:iCs w:val="false"/>
+          <w:i/>
+          <w:iCs/>
           <w:color w:val="auto"/>
           <w:kern w:val="2"/>
           <w:sz w:val="14"/>
@@ -14804,16 +14870,15 @@
           <w:u w:val="none"/>
           <w:lang w:val="en-US" w:eastAsia="zh-CN" w:bidi="hi-IN"/>
         </w:rPr>
-        <w:tab/>
-        <w:tab/>
+        <w:t xml:space="preserve"> </w:t>
       </w:r>
       <w:r>
         <w:rPr>
           <w:rFonts w:eastAsia="Songti SC" w:cs="Arial Unicode MS" w:ascii="Georgia" w:hAnsi="Georgia"/>
           <w:b w:val="false"/>
           <w:bCs w:val="false"/>
-          <w:i/>
-          <w:iCs/>
+          <w:i w:val="false"/>
+          <w:iCs w:val="false"/>
           <w:color w:val="auto"/>
           <w:kern w:val="2"/>
           <w:sz w:val="14"/>
@@ -14821,6 +14886,345 @@
           <w:u w:val="none"/>
           <w:lang w:val="en-US" w:eastAsia="zh-CN" w:bidi="hi-IN"/>
         </w:rPr>
+        <w:t>state</w:t>
+      </w:r>
+    </w:p>
+    <w:p>
+      <w:pPr>
+        <w:pStyle w:val="Normal"/>
+        <w:rPr/>
+      </w:pPr>
+      <w:r>
+        <w:rPr>
+          <w:rFonts w:ascii="Georgia" w:hAnsi="Georgia"/>
+          <w:sz w:val="14"/>
+          <w:szCs w:val="14"/>
+        </w:rPr>
+        <w:t xml:space="preserve"> </w:t>
+      </w:r>
+      <w:r>
+        <w:rPr>
+          <w:rFonts w:ascii="Georgia" w:hAnsi="Georgia"/>
+          <w:b/>
+          <w:bCs/>
+          <w:sz w:val="14"/>
+          <w:szCs w:val="14"/>
+        </w:rPr>
+        <w:tab/>
+        <w:tab/>
+      </w:r>
+      <w:r>
+        <w:rPr>
+          <w:rFonts w:ascii="Georgia" w:hAnsi="Georgia"/>
+          <w:b/>
+          <w:bCs/>
+          <w:i/>
+          <w:iCs/>
+          <w:sz w:val="14"/>
+          <w:szCs w:val="14"/>
+        </w:rPr>
+        <w:t>process-mem-virt</w:t>
+      </w:r>
+      <w:r>
+        <w:rPr>
+          <w:rFonts w:ascii="Georgia" w:hAnsi="Georgia"/>
+          <w:b/>
+          <w:bCs/>
+          <w:sz w:val="14"/>
+          <w:szCs w:val="14"/>
+        </w:rPr>
+        <w:tab/>
+      </w:r>
+      <w:r>
+        <w:rPr>
+          <w:rFonts w:ascii="Georgia" w:hAnsi="Georgia"/>
+          <w:b w:val="false"/>
+          <w:bCs w:val="false"/>
+          <w:i/>
+          <w:iCs/>
+          <w:sz w:val="14"/>
+          <w:szCs w:val="14"/>
+        </w:rPr>
+        <w:t>fixnum</w:t>
+        <w:tab/>
+      </w:r>
+      <w:r>
+        <w:rPr>
+          <w:rFonts w:ascii="Georgia" w:hAnsi="Georgia"/>
+          <w:b w:val="false"/>
+          <w:bCs w:val="false"/>
+          <w:i w:val="false"/>
+          <w:iCs w:val="false"/>
+          <w:sz w:val="14"/>
+          <w:szCs w:val="14"/>
+        </w:rPr>
+        <w:t>vmem</w:t>
+      </w:r>
+    </w:p>
+    <w:p>
+      <w:pPr>
+        <w:pStyle w:val="Normal"/>
+        <w:rPr/>
+      </w:pPr>
+      <w:r>
+        <w:rPr>
+          <w:rFonts w:ascii="Georgia" w:hAnsi="Georgia"/>
+          <w:b/>
+          <w:bCs/>
+          <w:sz w:val="14"/>
+          <w:szCs w:val="14"/>
+        </w:rPr>
+        <w:tab/>
+        <w:tab/>
+      </w:r>
+      <w:r>
+        <w:rPr>
+          <w:rFonts w:ascii="Georgia" w:hAnsi="Georgia"/>
+          <w:b/>
+          <w:bCs/>
+          <w:i/>
+          <w:iCs/>
+          <w:sz w:val="14"/>
+          <w:szCs w:val="14"/>
+        </w:rPr>
+        <w:t>process-mem-res</w:t>
+      </w:r>
+      <w:r>
+        <w:rPr>
+          <w:rFonts w:ascii="Georgia" w:hAnsi="Georgia"/>
+          <w:b/>
+          <w:bCs/>
+          <w:sz w:val="14"/>
+          <w:szCs w:val="14"/>
+        </w:rPr>
+        <w:tab/>
+      </w:r>
+      <w:r>
+        <w:rPr>
+          <w:rFonts w:ascii="Georgia" w:hAnsi="Georgia"/>
+          <w:b w:val="false"/>
+          <w:bCs w:val="false"/>
+          <w:i/>
+          <w:iCs/>
+          <w:sz w:val="14"/>
+          <w:szCs w:val="14"/>
+        </w:rPr>
+        <w:t>fixnum</w:t>
+        <w:tab/>
+      </w:r>
+      <w:r>
+        <w:rPr>
+          <w:rFonts w:ascii="Georgia" w:hAnsi="Georgia"/>
+          <w:b w:val="false"/>
+          <w:bCs w:val="false"/>
+          <w:i w:val="false"/>
+          <w:iCs w:val="false"/>
+          <w:sz w:val="14"/>
+          <w:szCs w:val="14"/>
+        </w:rPr>
+        <w:t>reserve</w:t>
+      </w:r>
+    </w:p>
+    <w:p>
+      <w:pPr>
+        <w:pStyle w:val="Normal"/>
+        <w:rPr/>
+      </w:pPr>
+      <w:r>
+        <w:rPr>
+          <w:rFonts w:ascii="Georgia" w:hAnsi="Georgia"/>
+          <w:b/>
+          <w:bCs/>
+          <w:sz w:val="14"/>
+          <w:szCs w:val="14"/>
+        </w:rPr>
+        <w:tab/>
+        <w:tab/>
+      </w:r>
+      <w:r>
+        <w:rPr>
+          <w:rFonts w:ascii="Georgia" w:hAnsi="Georgia"/>
+          <w:b/>
+          <w:bCs/>
+          <w:i/>
+          <w:iCs/>
+          <w:sz w:val="14"/>
+          <w:szCs w:val="14"/>
+        </w:rPr>
+        <w:t>process-time</w:t>
+      </w:r>
+      <w:r>
+        <w:rPr>
+          <w:rFonts w:ascii="Georgia" w:hAnsi="Georgia"/>
+          <w:b/>
+          <w:bCs/>
+          <w:sz w:val="14"/>
+          <w:szCs w:val="14"/>
+        </w:rPr>
+        <w:tab/>
+      </w:r>
+      <w:r>
+        <w:rPr>
+          <w:rFonts w:ascii="Georgia" w:hAnsi="Georgia"/>
+          <w:b w:val="false"/>
+          <w:bCs w:val="false"/>
+          <w:i/>
+          <w:iCs/>
+          <w:sz w:val="14"/>
+          <w:szCs w:val="14"/>
+        </w:rPr>
+        <w:t>fixnum</w:t>
+        <w:tab/>
+      </w:r>
+      <w:r>
+        <w:rPr>
+          <w:rFonts w:ascii="Georgia" w:hAnsi="Georgia"/>
+          <w:b w:val="false"/>
+          <w:bCs w:val="false"/>
+          <w:i w:val="false"/>
+          <w:iCs w:val="false"/>
+          <w:sz w:val="14"/>
+          <w:szCs w:val="14"/>
+        </w:rPr>
+        <w:t>microseconds</w:t>
+      </w:r>
+    </w:p>
+    <w:p>
+      <w:pPr>
+        <w:pStyle w:val="Normal"/>
+        <w:rPr/>
+      </w:pPr>
+      <w:r>
+        <w:rPr>
+          <w:b/>
+          <w:bCs/>
+        </w:rPr>
+        <w:t xml:space="preserve"> </w:t>
+      </w:r>
+      <w:r>
+        <w:rPr>
+          <w:b/>
+          <w:bCs/>
+        </w:rPr>
+        <w:tab/>
+        <w:tab/>
+      </w:r>
+      <w:r>
+        <w:rPr>
+          <w:rFonts w:ascii="Georgia" w:hAnsi="Georgia"/>
+          <w:b/>
+          <w:bCs/>
+          <w:i/>
+          <w:iCs/>
+          <w:sz w:val="14"/>
+          <w:szCs w:val="14"/>
+        </w:rPr>
+        <w:t>time-units-per-sec</w:t>
+      </w:r>
+      <w:r>
+        <w:rPr>
+          <w:rFonts w:ascii="Georgia" w:hAnsi="Georgia"/>
+          <w:b/>
+          <w:bCs/>
+          <w:sz w:val="14"/>
+          <w:szCs w:val="14"/>
+        </w:rPr>
+        <w:tab/>
+      </w:r>
+      <w:r>
+        <w:rPr>
+          <w:rFonts w:ascii="Georgia" w:hAnsi="Georgia"/>
+          <w:i/>
+          <w:iCs/>
+          <w:sz w:val="14"/>
+          <w:szCs w:val="14"/>
+        </w:rPr>
+        <w:t>fixnum</w:t>
+      </w:r>
+    </w:p>
+    <w:p>
+      <w:pPr>
+        <w:pStyle w:val="Normal"/>
+        <w:rPr>
+          <w:sz w:val="16"/>
+          <w:szCs w:val="16"/>
+        </w:rPr>
+      </w:pPr>
+      <w:r>
+        <w:rPr>
+          <w:rFonts w:ascii="Georgia" w:hAnsi="Georgia"/>
+          <w:b/>
+          <w:bCs/>
+          <w:i w:val="false"/>
+          <w:iCs w:val="false"/>
+          <w:sz w:val="16"/>
+          <w:szCs w:val="16"/>
+        </w:rPr>
+        <w:t xml:space="preserve">   </w:t>
+      </w:r>
+      <w:r>
+        <w:rPr>
+          <w:rFonts w:ascii="Georgia" w:hAnsi="Georgia"/>
+          <w:b/>
+          <w:bCs/>
+          <w:i w:val="false"/>
+          <w:iCs w:val="false"/>
+          <w:sz w:val="16"/>
+          <w:szCs w:val="16"/>
+        </w:rPr>
+        <w:tab/>
+        <w:tab/>
+      </w:r>
+      <w:r>
+        <w:rPr>
+          <w:rFonts w:ascii="Georgia" w:hAnsi="Georgia"/>
+          <w:b/>
+          <w:bCs/>
+          <w:i/>
+          <w:iCs/>
+          <w:sz w:val="14"/>
+          <w:szCs w:val="14"/>
+        </w:rPr>
+        <w:t>process-fds</w:t>
+      </w:r>
+      <w:r>
+        <w:rPr>
+          <w:rFonts w:ascii="Georgia" w:hAnsi="Georgia"/>
+          <w:b/>
+          <w:bCs/>
+          <w:i/>
+          <w:iCs/>
+          <w:sz w:val="14"/>
+          <w:szCs w:val="14"/>
+        </w:rPr>
+        <w:t xml:space="preserve"> </w:t>
+      </w:r>
+      <w:r>
+        <w:rPr>
+          <w:rFonts w:ascii="Georgia" w:hAnsi="Georgia"/>
+          <w:b w:val="false"/>
+          <w:bCs w:val="false"/>
+          <w:i/>
+          <w:iCs/>
+          <w:sz w:val="14"/>
+          <w:szCs w:val="14"/>
+        </w:rPr>
+        <w:tab/>
+      </w:r>
+      <w:r>
+        <w:rPr>
+          <w:rFonts w:eastAsia="Songti SC" w:cs="Arial Unicode MS" w:ascii="Georgia" w:hAnsi="Georgia"/>
+          <w:b w:val="false"/>
+          <w:bCs w:val="false"/>
+          <w:i/>
+          <w:iCs/>
+          <w:color w:val="auto"/>
+          <w:kern w:val="2"/>
+          <w:sz w:val="16"/>
+          <w:szCs w:val="16"/>
+          <w:u w:val="none"/>
+          <w:lang w:val="en-US" w:eastAsia="zh-CN" w:bidi="hi-IN"/>
+        </w:rPr>
         <w:t>list</w:t>
         <w:tab/>
       </w:r>
@@ -14829,8 +15233,8 @@
           <w:rFonts w:eastAsia="Songti SC" w:cs="Arial Unicode MS" w:ascii="Georgia" w:hAnsi="Georgia"/>
           <w:b w:val="false"/>
           <w:bCs w:val="false"/>
-          <w:i w:val="false"/>
-          <w:iCs w:val="false"/>
+          <w:i/>
+          <w:iCs/>
           <w:color w:val="auto"/>
           <w:kern w:val="2"/>
           <w:sz w:val="14"/>
@@ -14838,7 +15242,7 @@
           <w:u w:val="none"/>
           <w:lang w:val="en-US" w:eastAsia="zh-CN" w:bidi="hi-IN"/>
         </w:rPr>
-        <w:t>core</w:t>
+        <w:t>file descriptors</w:t>
       </w:r>
       <w:r>
         <w:rPr>
@@ -14849,399 +15253,104 @@
           <w:iCs/>
           <w:color w:val="auto"/>
           <w:kern w:val="2"/>
-          <w:sz w:val="14"/>
-          <w:szCs w:val="14"/>
+          <w:sz w:val="16"/>
+          <w:szCs w:val="16"/>
           <w:u w:val="none"/>
           <w:lang w:val="en-US" w:eastAsia="zh-CN" w:bidi="hi-IN"/>
         </w:rPr>
         <w:t xml:space="preserve"> </w:t>
       </w:r>
+    </w:p>
+    <w:p>
+      <w:pPr>
+        <w:pStyle w:val="Normal"/>
+        <w:rPr>
+          <w:sz w:val="16"/>
+          <w:szCs w:val="16"/>
+        </w:rPr>
+      </w:pPr>
       <w:r>
         <w:rPr>
           <w:rFonts w:eastAsia="Songti SC" w:cs="Arial Unicode MS" w:ascii="Georgia" w:hAnsi="Georgia"/>
-          <w:b w:val="false"/>
-          <w:bCs w:val="false"/>
+          <w:b/>
+          <w:bCs/>
           <w:i w:val="false"/>
           <w:iCs w:val="false"/>
           <w:color w:val="auto"/>
           <w:kern w:val="2"/>
-          <w:sz w:val="14"/>
-          <w:szCs w:val="14"/>
+          <w:sz w:val="16"/>
+          <w:szCs w:val="16"/>
           <w:u w:val="none"/>
           <w:lang w:val="en-US" w:eastAsia="zh-CN" w:bidi="hi-IN"/>
         </w:rPr>
-        <w:t>state</w:t>
-      </w:r>
-    </w:p>
-    <w:p>
-      <w:pPr>
-        <w:pStyle w:val="Normal"/>
-        <w:rPr/>
-      </w:pPr>
-      <w:r>
-        <w:rPr/>
-        <w:t xml:space="preserve"> </w:t>
-      </w:r>
-      <w:r>
-        <w:rPr/>
-        <w:tab/>
-        <w:tab/>
-      </w:r>
-      <w:r>
-        <w:rPr>
-          <w:rFonts w:ascii="Georgia" w:hAnsi="Georgia"/>
-          <w:b/>
-          <w:bCs/>
-          <w:i/>
-          <w:iCs/>
-          <w:sz w:val="14"/>
-          <w:szCs w:val="14"/>
+        <w:t xml:space="preserve">   </w:t>
+      </w:r>
+      <w:r>
+        <w:rPr>
+          <w:rFonts w:eastAsia="Songti SC" w:cs="Arial Unicode MS" w:ascii="Georgia" w:hAnsi="Georgia"/>
+          <w:b/>
+          <w:bCs/>
+          <w:i w:val="false"/>
+          <w:iCs w:val="false"/>
+          <w:color w:val="auto"/>
+          <w:kern w:val="2"/>
+          <w:sz w:val="16"/>
+          <w:szCs w:val="16"/>
+          <w:u w:val="none"/>
+          <w:lang w:val="en-US" w:eastAsia="zh-CN" w:bidi="hi-IN"/>
+        </w:rPr>
+        <w:tab/>
+        <w:tab/>
+      </w:r>
+      <w:r>
+        <w:rPr>
+          <w:rFonts w:eastAsia="Songti SC" w:cs="Arial Unicode MS" w:ascii="Georgia" w:hAnsi="Georgia"/>
+          <w:b/>
+          <w:bCs/>
+          <w:i/>
+          <w:iCs/>
+          <w:color w:val="auto"/>
+          <w:kern w:val="2"/>
+          <w:sz w:val="14"/>
+          <w:szCs w:val="14"/>
+          <w:u w:val="none"/>
+          <w:lang w:val="en-US" w:eastAsia="zh-CN" w:bidi="hi-IN"/>
         </w:rPr>
         <w:t>sleep</w:t>
       </w:r>
       <w:r>
         <w:rPr>
-          <w:rFonts w:ascii="Georgia" w:hAnsi="Georgia"/>
-          <w:sz w:val="14"/>
-          <w:szCs w:val="14"/>
-        </w:rPr>
-        <w:tab/>
-        <w:tab/>
-      </w:r>
-      <w:r>
-        <w:rPr>
-          <w:rFonts w:ascii="Georgia" w:hAnsi="Georgia"/>
-          <w:b w:val="false"/>
-          <w:bCs w:val="false"/>
-          <w:i/>
-          <w:iCs/>
-          <w:sz w:val="14"/>
-          <w:szCs w:val="14"/>
+          <w:rFonts w:eastAsia="Songti SC" w:cs="Arial Unicode MS" w:ascii="Georgia" w:hAnsi="Georgia"/>
+          <w:b/>
+          <w:bCs/>
+          <w:i/>
+          <w:iCs/>
+          <w:color w:val="auto"/>
+          <w:kern w:val="2"/>
+          <w:sz w:val="14"/>
+          <w:szCs w:val="14"/>
+          <w:u w:val="none"/>
+          <w:lang w:val="en-US" w:eastAsia="zh-CN" w:bidi="hi-IN"/>
+        </w:rPr>
+        <w:t xml:space="preserve"> </w:t>
+      </w:r>
+      <w:r>
+        <w:rPr>
+          <w:rFonts w:eastAsia="Songti SC" w:cs="Arial Unicode MS" w:ascii="Georgia" w:hAnsi="Georgia"/>
+          <w:b w:val="false"/>
+          <w:bCs w:val="false"/>
+          <w:i/>
+          <w:iCs/>
+          <w:color w:val="auto"/>
+          <w:kern w:val="2"/>
+          <w:sz w:val="14"/>
+          <w:szCs w:val="14"/>
+          <w:u w:val="none"/>
+          <w:lang w:val="en-US" w:eastAsia="zh-CN" w:bidi="hi-IN"/>
         </w:rPr>
         <w:t>fixnum</w:t>
         <w:tab/>
-      </w:r>
-      <w:r>
-        <w:rPr>
-          <w:rFonts w:ascii="Georgia" w:hAnsi="Georgia"/>
-          <w:b w:val="false"/>
-          <w:bCs w:val="false"/>
-          <w:sz w:val="14"/>
-          <w:szCs w:val="14"/>
-        </w:rPr>
-        <w:t>microseonds</w:t>
-      </w:r>
-    </w:p>
-    <w:p>
-      <w:pPr>
-        <w:pStyle w:val="Normal"/>
-        <w:rPr/>
-      </w:pPr>
-      <w:r>
-        <w:rPr>
-          <w:rFonts w:ascii="Georgia" w:hAnsi="Georgia"/>
-          <w:sz w:val="14"/>
-          <w:szCs w:val="14"/>
-        </w:rPr>
-        <w:t xml:space="preserve"> </w:t>
-      </w:r>
-      <w:r>
-        <w:rPr>
-          <w:rFonts w:ascii="Georgia" w:hAnsi="Georgia"/>
-          <w:b/>
-          <w:bCs/>
-          <w:sz w:val="14"/>
-          <w:szCs w:val="14"/>
-        </w:rPr>
-        <w:tab/>
-        <w:tab/>
-      </w:r>
-      <w:r>
-        <w:rPr>
-          <w:rFonts w:ascii="Georgia" w:hAnsi="Georgia"/>
-          <w:b/>
-          <w:bCs/>
-          <w:i/>
-          <w:iCs/>
-          <w:sz w:val="14"/>
-          <w:szCs w:val="14"/>
-        </w:rPr>
-        <w:t>process-mem-virt</w:t>
-      </w:r>
-      <w:r>
-        <w:rPr>
-          <w:rFonts w:ascii="Georgia" w:hAnsi="Georgia"/>
-          <w:b/>
-          <w:bCs/>
-          <w:sz w:val="14"/>
-          <w:szCs w:val="14"/>
-        </w:rPr>
-        <w:tab/>
-      </w:r>
-      <w:r>
-        <w:rPr>
-          <w:rFonts w:ascii="Georgia" w:hAnsi="Georgia"/>
-          <w:b w:val="false"/>
-          <w:bCs w:val="false"/>
-          <w:i/>
-          <w:iCs/>
-          <w:sz w:val="14"/>
-          <w:szCs w:val="14"/>
-        </w:rPr>
-        <w:t>fixnum</w:t>
-        <w:tab/>
-      </w:r>
-      <w:r>
-        <w:rPr>
-          <w:rFonts w:ascii="Georgia" w:hAnsi="Georgia"/>
-          <w:b w:val="false"/>
-          <w:bCs w:val="false"/>
-          <w:i w:val="false"/>
-          <w:iCs w:val="false"/>
-          <w:sz w:val="14"/>
-          <w:szCs w:val="14"/>
-        </w:rPr>
-        <w:t>vmem</w:t>
-      </w:r>
-    </w:p>
-    <w:p>
-      <w:pPr>
-        <w:pStyle w:val="Normal"/>
-        <w:rPr/>
-      </w:pPr>
-      <w:r>
-        <w:rPr>
-          <w:rFonts w:ascii="Georgia" w:hAnsi="Georgia"/>
-          <w:b/>
-          <w:bCs/>
-          <w:sz w:val="14"/>
-          <w:szCs w:val="14"/>
-        </w:rPr>
-        <w:tab/>
-        <w:tab/>
-      </w:r>
-      <w:r>
-        <w:rPr>
-          <w:rFonts w:ascii="Georgia" w:hAnsi="Georgia"/>
-          <w:b/>
-          <w:bCs/>
-          <w:i/>
-          <w:iCs/>
-          <w:sz w:val="14"/>
-          <w:szCs w:val="14"/>
-        </w:rPr>
-        <w:t>process-mem-res</w:t>
-      </w:r>
-      <w:r>
-        <w:rPr>
-          <w:rFonts w:ascii="Georgia" w:hAnsi="Georgia"/>
-          <w:b/>
-          <w:bCs/>
-          <w:sz w:val="14"/>
-          <w:szCs w:val="14"/>
-        </w:rPr>
-        <w:tab/>
-      </w:r>
-      <w:r>
-        <w:rPr>
-          <w:rFonts w:ascii="Georgia" w:hAnsi="Georgia"/>
-          <w:b w:val="false"/>
-          <w:bCs w:val="false"/>
-          <w:i/>
-          <w:iCs/>
-          <w:sz w:val="14"/>
-          <w:szCs w:val="14"/>
-        </w:rPr>
-        <w:t>fixnum</w:t>
-        <w:tab/>
-      </w:r>
-      <w:r>
-        <w:rPr>
-          <w:rFonts w:ascii="Georgia" w:hAnsi="Georgia"/>
-          <w:b w:val="false"/>
-          <w:bCs w:val="false"/>
-          <w:i w:val="false"/>
-          <w:iCs w:val="false"/>
-          <w:sz w:val="14"/>
-          <w:szCs w:val="14"/>
-        </w:rPr>
-        <w:t>reserve</w:t>
-      </w:r>
-    </w:p>
-    <w:p>
-      <w:pPr>
-        <w:pStyle w:val="Normal"/>
-        <w:rPr/>
-      </w:pPr>
-      <w:r>
-        <w:rPr>
-          <w:rFonts w:ascii="Georgia" w:hAnsi="Georgia"/>
-          <w:b/>
-          <w:bCs/>
-          <w:sz w:val="14"/>
-          <w:szCs w:val="14"/>
-        </w:rPr>
-        <w:tab/>
-        <w:tab/>
-      </w:r>
-      <w:r>
-        <w:rPr>
-          <w:rFonts w:ascii="Georgia" w:hAnsi="Georgia"/>
-          <w:b/>
-          <w:bCs/>
-          <w:i/>
-          <w:iCs/>
-          <w:sz w:val="14"/>
-          <w:szCs w:val="14"/>
-        </w:rPr>
-        <w:t>process-time</w:t>
-      </w:r>
-      <w:r>
-        <w:rPr>
-          <w:rFonts w:ascii="Georgia" w:hAnsi="Georgia"/>
-          <w:b/>
-          <w:bCs/>
-          <w:sz w:val="14"/>
-          <w:szCs w:val="14"/>
-        </w:rPr>
-        <w:tab/>
-      </w:r>
-      <w:r>
-        <w:rPr>
-          <w:rFonts w:ascii="Georgia" w:hAnsi="Georgia"/>
-          <w:b w:val="false"/>
-          <w:bCs w:val="false"/>
-          <w:i/>
-          <w:iCs/>
-          <w:sz w:val="14"/>
-          <w:szCs w:val="14"/>
-        </w:rPr>
-        <w:t>fixnum</w:t>
-        <w:tab/>
-      </w:r>
-      <w:r>
-        <w:rPr>
-          <w:rFonts w:ascii="Georgia" w:hAnsi="Georgia"/>
-          <w:b w:val="false"/>
-          <w:bCs w:val="false"/>
-          <w:i w:val="false"/>
-          <w:iCs w:val="false"/>
-          <w:sz w:val="14"/>
-          <w:szCs w:val="14"/>
-        </w:rPr>
-        <w:t>microseconds</w:t>
-      </w:r>
-    </w:p>
-    <w:p>
-      <w:pPr>
-        <w:pStyle w:val="Normal"/>
-        <w:rPr/>
-      </w:pPr>
-      <w:r>
-        <w:rPr>
-          <w:b/>
-          <w:bCs/>
-        </w:rPr>
-        <w:t xml:space="preserve"> </w:t>
-      </w:r>
-      <w:r>
-        <w:rPr>
-          <w:b/>
-          <w:bCs/>
-        </w:rPr>
-        <w:tab/>
-        <w:tab/>
-      </w:r>
-      <w:r>
-        <w:rPr>
-          <w:rFonts w:ascii="Georgia" w:hAnsi="Georgia"/>
-          <w:b/>
-          <w:bCs/>
-          <w:i/>
-          <w:iCs/>
-          <w:sz w:val="14"/>
-          <w:szCs w:val="14"/>
-        </w:rPr>
-        <w:t>time-units-per-sec</w:t>
-      </w:r>
-      <w:r>
-        <w:rPr>
-          <w:rFonts w:ascii="Georgia" w:hAnsi="Georgia"/>
-          <w:b/>
-          <w:bCs/>
-          <w:sz w:val="14"/>
-          <w:szCs w:val="14"/>
-        </w:rPr>
-        <w:tab/>
-      </w:r>
-      <w:r>
-        <w:rPr>
-          <w:rFonts w:ascii="Georgia" w:hAnsi="Georgia"/>
-          <w:i/>
-          <w:iCs/>
-          <w:sz w:val="14"/>
-          <w:szCs w:val="14"/>
-        </w:rPr>
-        <w:t>fixnum</w:t>
-      </w:r>
-    </w:p>
-    <w:p>
-      <w:pPr>
-        <w:pStyle w:val="Normal"/>
-        <w:rPr>
-          <w:sz w:val="16"/>
-          <w:szCs w:val="16"/>
-        </w:rPr>
-      </w:pPr>
-      <w:r>
-        <w:rPr>
-          <w:rFonts w:ascii="Georgia" w:hAnsi="Georgia"/>
-          <w:b/>
-          <w:bCs/>
-          <w:i w:val="false"/>
-          <w:iCs w:val="false"/>
-          <w:sz w:val="16"/>
-          <w:szCs w:val="16"/>
-        </w:rPr>
-        <w:t xml:space="preserve">   </w:t>
-      </w:r>
-      <w:r>
-        <w:rPr>
-          <w:rFonts w:ascii="Georgia" w:hAnsi="Georgia"/>
-          <w:b/>
-          <w:bCs/>
-          <w:i w:val="false"/>
-          <w:iCs w:val="false"/>
-          <w:sz w:val="16"/>
-          <w:szCs w:val="16"/>
-        </w:rPr>
-        <w:tab/>
-        <w:tab/>
-      </w:r>
-      <w:r>
-        <w:rPr>
-          <w:rFonts w:ascii="Georgia" w:hAnsi="Georgia"/>
-          <w:b/>
-          <w:bCs/>
-          <w:i/>
-          <w:iCs/>
-          <w:sz w:val="14"/>
-          <w:szCs w:val="14"/>
-        </w:rPr>
-        <w:t xml:space="preserve">namespace  </w:t>
-      </w:r>
-      <w:r>
-        <w:rPr>
-          <w:rFonts w:ascii="Georgia" w:hAnsi="Georgia"/>
-          <w:b w:val="false"/>
-          <w:bCs w:val="false"/>
-          <w:i/>
-          <w:iCs/>
-          <w:sz w:val="14"/>
-          <w:szCs w:val="14"/>
-        </w:rPr>
-        <w:t>string</w:t>
-        <w:tab/>
+        <w:t>()</w:t>
       </w:r>
       <w:r>
         <w:rPr>
@@ -15257,7 +15366,6 @@
           <w:u w:val="none"/>
           <w:lang w:val="en-US" w:eastAsia="zh-CN" w:bidi="hi-IN"/>
         </w:rPr>
-        <w:t>list</w:t>
         <w:tab/>
       </w:r>
       <w:r>
@@ -15265,8 +15373,8 @@
           <w:rFonts w:eastAsia="Songti SC" w:cs="Arial Unicode MS" w:ascii="Georgia" w:hAnsi="Georgia"/>
           <w:b w:val="false"/>
           <w:bCs w:val="false"/>
-          <w:i/>
-          <w:iCs/>
+          <w:i w:val="false"/>
+          <w:iCs w:val="false"/>
           <w:color w:val="auto"/>
           <w:kern w:val="2"/>
           <w:sz w:val="14"/>
@@ -15274,7 +15382,7 @@
           <w:u w:val="none"/>
           <w:lang w:val="en-US" w:eastAsia="zh-CN" w:bidi="hi-IN"/>
         </w:rPr>
-        <w:t>symbol</w:t>
+        <w:t>sleep for usecs</w:t>
       </w:r>
       <w:r>
         <w:rPr>
@@ -15291,22 +15399,6 @@
           <w:lang w:val="en-US" w:eastAsia="zh-CN" w:bidi="hi-IN"/>
         </w:rPr>
         <w:t xml:space="preserve"> </w:t>
-      </w:r>
-      <w:r>
-        <w:rPr>
-          <w:rFonts w:eastAsia="Songti SC" w:cs="Arial Unicode MS" w:ascii="Georgia" w:hAnsi="Georgia"/>
-          <w:b w:val="false"/>
-          <w:bCs w:val="false"/>
-          <w:i w:val="false"/>
-          <w:iCs w:val="false"/>
-          <w:color w:val="auto"/>
-          <w:kern w:val="2"/>
-          <w:sz w:val="16"/>
-          <w:szCs w:val="16"/>
-          <w:u w:val="none"/>
-          <w:lang w:val="en-US" w:eastAsia="zh-CN" w:bidi="hi-IN"/>
-        </w:rPr>
-        <w:t>list</w:t>
       </w:r>
     </w:p>
     <w:p>
@@ -15429,14 +15521,16 @@
           <w:lang w:val="en-US" w:eastAsia="zh-CN" w:bidi="hi-IN"/>
         </w:rPr>
         <w:t>list</w:t>
+        <w:tab/>
+        <w:t xml:space="preserve">list </w:t>
       </w:r>
       <w:r>
         <w:rPr>
           <w:rFonts w:eastAsia="Songti SC" w:cs="Arial Unicode MS" w:ascii="Georgia" w:hAnsi="Georgia"/>
           <w:b w:val="false"/>
           <w:bCs w:val="false"/>
-          <w:i/>
-          <w:iCs/>
+          <w:i w:val="false"/>
+          <w:iCs w:val="false"/>
           <w:color w:val="auto"/>
           <w:kern w:val="2"/>
           <w:sz w:val="14"/>
@@ -15444,13 +15538,36 @@
           <w:u w:val="none"/>
           <w:lang w:val="en-US" w:eastAsia="zh-CN" w:bidi="hi-IN"/>
         </w:rPr>
+        <w:t>of heap info</w:t>
+      </w:r>
+    </w:p>
+    <w:p>
+      <w:pPr>
+        <w:pStyle w:val="Normal"/>
+        <w:rPr/>
+      </w:pPr>
+      <w:r>
+        <w:rPr>
+          <w:rFonts w:eastAsia="Songti SC" w:cs="Arial Unicode MS" w:ascii="Andale Mono" w:hAnsi="Andale Mono"/>
+          <w:b w:val="false"/>
+          <w:bCs w:val="false"/>
+          <w:i/>
+          <w:iCs/>
+          <w:color w:val="auto"/>
+          <w:kern w:val="2"/>
+          <w:sz w:val="14"/>
+          <w:szCs w:val="14"/>
+          <w:u w:val="none"/>
+          <w:lang w:val="en-US" w:eastAsia="zh-CN" w:bidi="hi-IN"/>
+        </w:rPr>
+        <w:tab/>
         <w:tab/>
       </w:r>
       <w:r>
         <w:rPr>
           <w:rFonts w:eastAsia="Songti SC" w:cs="Arial Unicode MS" w:ascii="Georgia" w:hAnsi="Georgia"/>
-          <w:b w:val="false"/>
-          <w:bCs w:val="false"/>
+          <w:b/>
+          <w:bCs/>
           <w:i/>
           <w:iCs/>
           <w:color w:val="auto"/>
@@ -15460,15 +15577,15 @@
           <w:u w:val="none"/>
           <w:lang w:val="en-US" w:eastAsia="zh-CN" w:bidi="hi-IN"/>
         </w:rPr>
-        <w:t xml:space="preserve">list </w:t>
+        <w:t xml:space="preserve">heap-room </w:t>
       </w:r>
       <w:r>
         <w:rPr>
           <w:rFonts w:eastAsia="Songti SC" w:cs="Arial Unicode MS" w:ascii="Georgia" w:hAnsi="Georgia"/>
           <w:b w:val="false"/>
           <w:bCs w:val="false"/>
-          <w:i w:val="false"/>
-          <w:iCs w:val="false"/>
+          <w:i/>
+          <w:iCs/>
           <w:color w:val="auto"/>
           <w:kern w:val="2"/>
           <w:sz w:val="14"/>
@@ -15476,13 +15593,13 @@
           <w:u w:val="none"/>
           <w:lang w:val="en-US" w:eastAsia="zh-CN" w:bidi="hi-IN"/>
         </w:rPr>
-        <w:t xml:space="preserve">of </w:t>
+        <w:t>key</w:t>
       </w:r>
       <w:r>
         <w:rPr>
           <w:rFonts w:eastAsia="Songti SC" w:cs="Arial Unicode MS" w:ascii="Georgia" w:hAnsi="Georgia"/>
-          <w:b w:val="false"/>
-          <w:bCs w:val="false"/>
+          <w:b/>
+          <w:bCs/>
           <w:i w:val="false"/>
           <w:iCs w:val="false"/>
           <w:color w:val="auto"/>
@@ -15492,7 +15609,57 @@
           <w:u w:val="none"/>
           <w:lang w:val="en-US" w:eastAsia="zh-CN" w:bidi="hi-IN"/>
         </w:rPr>
-        <w:t>heap info</w:t>
+        <w:tab/>
+      </w:r>
+      <w:r>
+        <w:rPr>
+          <w:rFonts w:eastAsia="Songti SC" w:cs="Arial Unicode MS" w:ascii="Georgia" w:hAnsi="Georgia"/>
+          <w:b w:val="false"/>
+          <w:bCs w:val="false"/>
+          <w:i/>
+          <w:iCs/>
+          <w:color w:val="auto"/>
+          <w:kern w:val="2"/>
+          <w:sz w:val="14"/>
+          <w:szCs w:val="14"/>
+          <w:u w:val="none"/>
+          <w:lang w:val="en-US" w:eastAsia="zh-CN" w:bidi="hi-IN"/>
+        </w:rPr>
+        <w:t>vector</w:t>
+        <w:tab/>
+      </w:r>
+      <w:r>
+        <w:rPr>
+          <w:rFonts w:eastAsia="Songti SC" w:cs="Arial Unicode MS" w:ascii="Georgia" w:hAnsi="Georgia"/>
+          <w:b w:val="false"/>
+          <w:bCs w:val="false"/>
+          <w:i w:val="false"/>
+          <w:iCs w:val="false"/>
+          <w:color w:val="auto"/>
+          <w:kern w:val="2"/>
+          <w:sz w:val="14"/>
+          <w:szCs w:val="14"/>
+          <w:u w:val="none"/>
+          <w:lang w:val="en-US" w:eastAsia="zh-CN" w:bidi="hi-IN"/>
+        </w:rPr>
+        <w:t>allocations</w:t>
+      </w:r>
+      <w:r>
+        <w:rPr>
+          <w:rFonts w:eastAsia="Songti SC" w:cs="Arial Unicode MS" w:ascii="Andale Mono" w:hAnsi="Andale Mono"/>
+          <w:b w:val="false"/>
+          <w:bCs w:val="false"/>
+          <w:i/>
+          <w:iCs/>
+          <w:color w:val="auto"/>
+          <w:kern w:val="2"/>
+          <w:sz w:val="14"/>
+          <w:szCs w:val="14"/>
+          <w:u w:val="none"/>
+          <w:lang w:val="en-US" w:eastAsia="zh-CN" w:bidi="hi-IN"/>
+        </w:rPr>
+        <w:tab/>
+        <w:t xml:space="preserve"> </w:t>
       </w:r>
     </w:p>
     <w:p>
@@ -15502,6 +15669,39 @@
       </w:pPr>
       <w:r>
         <w:rPr>
+          <w:rFonts w:eastAsia="Songti SC" w:cs="Arial Unicode MS" w:ascii="Courier New" w:hAnsi="Courier New"/>
+          <w:b/>
+          <w:bCs/>
+          <w:i w:val="false"/>
+          <w:iCs w:val="false"/>
+          <w:color w:val="auto"/>
+          <w:kern w:val="2"/>
+          <w:sz w:val="14"/>
+          <w:szCs w:val="14"/>
+          <w:u w:val="none"/>
+          <w:lang w:val="en-US" w:eastAsia="zh-CN" w:bidi="hi-IN"/>
+        </w:rPr>
+        <w:tab/>
+        <w:tab/>
+      </w:r>
+      <w:r>
+        <w:rPr>
+          <w:rFonts w:eastAsia="Songti SC" w:cs="Arial Unicode MS" w:ascii="Courier New" w:hAnsi="Courier New"/>
+          <w:b/>
+          <w:bCs/>
+          <w:i/>
+          <w:iCs/>
+          <w:color w:val="auto"/>
+          <w:kern w:val="2"/>
+          <w:sz w:val="14"/>
+          <w:szCs w:val="14"/>
+          <w:u w:val="none"/>
+          <w:lang w:val="en-US" w:eastAsia="zh-CN" w:bidi="hi-IN"/>
+        </w:rPr>
+        <w:t xml:space="preserve">    </w:t>
+      </w:r>
+      <w:r>
+        <w:rPr>
           <w:rFonts w:eastAsia="Songti SC" w:cs="Arial Unicode MS" w:ascii="Andale Mono" w:hAnsi="Andale Mono"/>
           <w:b w:val="false"/>
           <w:bCs w:val="false"/>
@@ -15514,9 +15714,14 @@
           <w:u w:val="none"/>
           <w:lang w:val="en-US" w:eastAsia="zh-CN" w:bidi="hi-IN"/>
         </w:rPr>
-        <w:tab/>
-        <w:tab/>
-      </w:r>
+        <w:t>#(:t size total free …)</w:t>
+      </w:r>
+    </w:p>
+    <w:p>
+      <w:pPr>
+        <w:pStyle w:val="Normal"/>
+        <w:rPr/>
+      </w:pPr>
       <w:r>
         <w:rPr>
           <w:rFonts w:eastAsia="Songti SC" w:cs="Arial Unicode MS" w:ascii="Georgia" w:hAnsi="Georgia"/>
@@ -15531,13 +15736,13 @@
           <w:u w:val="none"/>
           <w:lang w:val="en-US" w:eastAsia="zh-CN" w:bidi="hi-IN"/>
         </w:rPr>
-        <w:t xml:space="preserve">heap-room </w:t>
+        <w:t xml:space="preserve"> </w:t>
       </w:r>
       <w:r>
         <w:rPr>
           <w:rFonts w:eastAsia="Songti SC" w:cs="Arial Unicode MS" w:ascii="Georgia" w:hAnsi="Georgia"/>
-          <w:b w:val="false"/>
-          <w:bCs w:val="false"/>
+          <w:b/>
+          <w:bCs/>
           <w:i/>
           <w:iCs/>
           <w:color w:val="auto"/>
@@ -15547,6 +15752,40 @@
           <w:u w:val="none"/>
           <w:lang w:val="en-US" w:eastAsia="zh-CN" w:bidi="hi-IN"/>
         </w:rPr>
+        <w:tab/>
+        <w:tab/>
+        <w:t>heap-size</w:t>
+      </w:r>
+      <w:r>
+        <w:rPr>
+          <w:rFonts w:eastAsia="Songti SC" w:cs="Arial Unicode MS" w:ascii="Georgia" w:hAnsi="Georgia"/>
+          <w:b/>
+          <w:bCs/>
+          <w:i w:val="false"/>
+          <w:iCs w:val="false"/>
+          <w:color w:val="auto"/>
+          <w:kern w:val="2"/>
+          <w:sz w:val="14"/>
+          <w:szCs w:val="14"/>
+          <w:u w:val="none"/>
+          <w:lang w:val="en-US" w:eastAsia="zh-CN" w:bidi="hi-IN"/>
+        </w:rPr>
+        <w:t xml:space="preserve"> </w:t>
+      </w:r>
+      <w:r>
+        <w:rPr>
+          <w:rFonts w:eastAsia="Songti SC" w:cs="Arial Unicode MS" w:ascii="Georgia" w:hAnsi="Georgia"/>
+          <w:b w:val="false"/>
+          <w:bCs w:val="false"/>
+          <w:i/>
+          <w:iCs/>
+          <w:color w:val="auto"/>
+          <w:kern w:val="2"/>
+          <w:sz w:val="14"/>
+          <w:szCs w:val="14"/>
+          <w:u w:val="none"/>
+          <w:lang w:val="en-US" w:eastAsia="zh-CN" w:bidi="hi-IN"/>
+        </w:rPr>
         <w:t>key</w:t>
       </w:r>
       <w:r>
@@ -15564,6 +15803,7 @@
           <w:lang w:val="en-US" w:eastAsia="zh-CN" w:bidi="hi-IN"/>
         </w:rPr>
         <w:tab/>
+        <w:t xml:space="preserve"> </w:t>
       </w:r>
       <w:r>
         <w:rPr>
@@ -15579,6 +15819,94 @@
           <w:u w:val="none"/>
           <w:lang w:val="en-US" w:eastAsia="zh-CN" w:bidi="hi-IN"/>
         </w:rPr>
+        <w:t>fixnum</w:t>
+        <w:tab/>
+      </w:r>
+      <w:r>
+        <w:rPr>
+          <w:rFonts w:eastAsia="Songti SC" w:cs="Arial Unicode MS" w:ascii="Georgia" w:hAnsi="Georgia"/>
+          <w:b w:val="false"/>
+          <w:bCs w:val="false"/>
+          <w:i w:val="false"/>
+          <w:iCs w:val="false"/>
+          <w:color w:val="auto"/>
+          <w:kern w:val="2"/>
+          <w:sz w:val="14"/>
+          <w:szCs w:val="14"/>
+          <w:u w:val="none"/>
+          <w:lang w:val="en-US" w:eastAsia="zh-CN" w:bidi="hi-IN"/>
+        </w:rPr>
+        <w:t>type size</w:t>
+      </w:r>
+    </w:p>
+    <w:p>
+      <w:pPr>
+        <w:pStyle w:val="Normal"/>
+        <w:rPr/>
+      </w:pPr>
+      <w:r>
+        <w:rPr>
+          <w:rFonts w:eastAsia="Songti SC" w:cs="Arial Unicode MS" w:ascii="Andale Mono" w:hAnsi="Andale Mono"/>
+          <w:b w:val="false"/>
+          <w:bCs w:val="false"/>
+          <w:i/>
+          <w:iCs/>
+          <w:color w:val="auto"/>
+          <w:kern w:val="2"/>
+          <w:sz w:val="14"/>
+          <w:szCs w:val="14"/>
+          <w:u w:val="none"/>
+          <w:lang w:val="en-US" w:eastAsia="zh-CN" w:bidi="hi-IN"/>
+        </w:rPr>
+        <w:tab/>
+        <w:tab/>
+      </w:r>
+      <w:r>
+        <w:rPr>
+          <w:rFonts w:eastAsia="Songti SC" w:cs="Arial Unicode MS" w:ascii="Georgia" w:hAnsi="Georgia"/>
+          <w:b/>
+          <w:bCs/>
+          <w:i/>
+          <w:iCs/>
+          <w:color w:val="auto"/>
+          <w:kern w:val="2"/>
+          <w:sz w:val="14"/>
+          <w:szCs w:val="14"/>
+          <w:u w:val="none"/>
+          <w:lang w:val="en-US" w:eastAsia="zh-CN" w:bidi="hi-IN"/>
+        </w:rPr>
+        <w:t>cache-room</w:t>
+      </w:r>
+      <w:r>
+        <w:rPr>
+          <w:rFonts w:eastAsia="Songti SC" w:cs="Arial Unicode MS" w:ascii="Georgia" w:hAnsi="Georgia"/>
+          <w:b/>
+          <w:bCs/>
+          <w:i w:val="false"/>
+          <w:iCs w:val="false"/>
+          <w:color w:val="auto"/>
+          <w:kern w:val="2"/>
+          <w:sz w:val="14"/>
+          <w:szCs w:val="14"/>
+          <w:u w:val="none"/>
+          <w:lang w:val="en-US" w:eastAsia="zh-CN" w:bidi="hi-IN"/>
+        </w:rPr>
+        <w:tab/>
+      </w:r>
+      <w:r>
+        <w:rPr>
+          <w:rFonts w:eastAsia="Songti SC" w:cs="Arial Unicode MS" w:ascii="Georgia" w:hAnsi="Georgia"/>
+          <w:b w:val="false"/>
+          <w:bCs w:val="false"/>
+          <w:i/>
+          <w:iCs/>
+          <w:color w:val="auto"/>
+          <w:kern w:val="2"/>
+          <w:sz w:val="14"/>
+          <w:szCs w:val="14"/>
+          <w:u w:val="none"/>
+          <w:lang w:val="en-US" w:eastAsia="zh-CN" w:bidi="hi-IN"/>
+        </w:rPr>
         <w:t>vector</w:t>
         <w:tab/>
       </w:r>
@@ -15598,6 +15926,45 @@
         </w:rPr>
         <w:t>allocations</w:t>
       </w:r>
+    </w:p>
+    <w:p>
+      <w:pPr>
+        <w:pStyle w:val="Normal"/>
+        <w:rPr/>
+      </w:pPr>
+      <w:r>
+        <w:rPr>
+          <w:rFonts w:eastAsia="Songti SC" w:cs="Arial Unicode MS" w:ascii="Courier New" w:hAnsi="Courier New"/>
+          <w:b/>
+          <w:bCs/>
+          <w:i w:val="false"/>
+          <w:iCs w:val="false"/>
+          <w:color w:val="auto"/>
+          <w:kern w:val="2"/>
+          <w:sz w:val="14"/>
+          <w:szCs w:val="14"/>
+          <w:u w:val="none"/>
+          <w:lang w:val="en-US" w:eastAsia="zh-CN" w:bidi="hi-IN"/>
+        </w:rPr>
+        <w:tab/>
+        <w:tab/>
+      </w:r>
+      <w:r>
+        <w:rPr>
+          <w:rFonts w:eastAsia="Songti SC" w:cs="Arial Unicode MS" w:ascii="Courier New" w:hAnsi="Courier New"/>
+          <w:b/>
+          <w:bCs/>
+          <w:i/>
+          <w:iCs/>
+          <w:color w:val="auto"/>
+          <w:kern w:val="2"/>
+          <w:sz w:val="14"/>
+          <w:szCs w:val="14"/>
+          <w:u w:val="none"/>
+          <w:lang w:val="en-US" w:eastAsia="zh-CN" w:bidi="hi-IN"/>
+        </w:rPr>
+        <w:t xml:space="preserve">    </w:t>
+      </w:r>
       <w:r>
         <w:rPr>
           <w:rFonts w:eastAsia="Songti SC" w:cs="Arial Unicode MS" w:ascii="Andale Mono" w:hAnsi="Andale Mono"/>
@@ -15612,8 +15979,7 @@
           <w:u w:val="none"/>
           <w:lang w:val="en-US" w:eastAsia="zh-CN" w:bidi="hi-IN"/>
         </w:rPr>
-        <w:tab/>
-        <w:t xml:space="preserve"> </w:t>
+        <w:t>#(:t size total …)</w:t>
       </w:r>
     </w:p>
     <w:p>
@@ -15623,11 +15989,11 @@
       </w:pPr>
       <w:r>
         <w:rPr>
-          <w:rFonts w:eastAsia="Songti SC" w:cs="Arial Unicode MS" w:ascii="Courier New" w:hAnsi="Courier New"/>
-          <w:b/>
-          <w:bCs/>
-          <w:i w:val="false"/>
-          <w:iCs w:val="false"/>
+          <w:rFonts w:eastAsia="Songti SC" w:cs="Arial Unicode MS" w:ascii="Georgia" w:hAnsi="Georgia"/>
+          <w:b/>
+          <w:bCs/>
+          <w:i/>
+          <w:iCs/>
           <w:color w:val="auto"/>
           <w:kern w:val="2"/>
           <w:sz w:val="14"/>
@@ -15637,14 +16003,15 @@
         </w:rPr>
         <w:tab/>
         <w:tab/>
-      </w:r>
-      <w:r>
-        <w:rPr>
-          <w:rFonts w:eastAsia="Songti SC" w:cs="Arial Unicode MS" w:ascii="Courier New" w:hAnsi="Courier New"/>
-          <w:b/>
-          <w:bCs/>
-          <w:i/>
-          <w:iCs/>
+        <w:t>load</w:t>
+      </w:r>
+      <w:r>
+        <w:rPr>
+          <w:rFonts w:eastAsia="Songti SC" w:cs="Arial Unicode MS" w:ascii="Georgia" w:hAnsi="Georgia"/>
+          <w:b/>
+          <w:bCs/>
+          <w:i w:val="false"/>
+          <w:iCs w:val="false"/>
           <w:color w:val="auto"/>
           <w:kern w:val="2"/>
           <w:sz w:val="14"/>
@@ -15652,11 +16019,11 @@
           <w:u w:val="none"/>
           <w:lang w:val="en-US" w:eastAsia="zh-CN" w:bidi="hi-IN"/>
         </w:rPr>
-        <w:t xml:space="preserve">    </w:t>
-      </w:r>
-      <w:r>
-        <w:rPr>
-          <w:rFonts w:eastAsia="Songti SC" w:cs="Arial Unicode MS" w:ascii="Andale Mono" w:hAnsi="Andale Mono"/>
+        <w:t xml:space="preserve"> </w:t>
+      </w:r>
+      <w:r>
+        <w:rPr>
+          <w:rFonts w:eastAsia="Songti SC" w:cs="Arial Unicode MS" w:ascii="Georgia" w:hAnsi="Georgia"/>
           <w:b w:val="false"/>
           <w:bCs w:val="false"/>
           <w:i/>
@@ -15668,7 +16035,88 @@
           <w:u w:val="none"/>
           <w:lang w:val="en-US" w:eastAsia="zh-CN" w:bidi="hi-IN"/>
         </w:rPr>
-        <w:t>#(:t size total free …)</w:t>
+        <w:t>string</w:t>
+      </w:r>
+      <w:r>
+        <w:rPr>
+          <w:rFonts w:eastAsia="Songti SC" w:cs="Arial Unicode MS" w:ascii="Georgia" w:hAnsi="Georgia"/>
+          <w:b/>
+          <w:bCs/>
+          <w:i w:val="false"/>
+          <w:iCs w:val="false"/>
+          <w:color w:val="auto"/>
+          <w:kern w:val="2"/>
+          <w:sz w:val="14"/>
+          <w:szCs w:val="14"/>
+          <w:u w:val="none"/>
+          <w:lang w:val="en-US" w:eastAsia="zh-CN" w:bidi="hi-IN"/>
+        </w:rPr>
+        <w:tab/>
+      </w:r>
+      <w:r>
+        <w:rPr>
+          <w:rFonts w:eastAsia="Songti SC" w:cs="Arial Unicode MS" w:ascii="Georgia" w:hAnsi="Georgia"/>
+          <w:b w:val="false"/>
+          <w:bCs w:val="false"/>
+          <w:i/>
+          <w:iCs/>
+          <w:color w:val="auto"/>
+          <w:kern w:val="2"/>
+          <w:sz w:val="14"/>
+          <w:szCs w:val="14"/>
+          <w:u w:val="none"/>
+          <w:lang w:val="en-US" w:eastAsia="zh-CN" w:bidi="hi-IN"/>
+        </w:rPr>
+        <w:t>bool</w:t>
+        <w:tab/>
+      </w:r>
+      <w:r>
+        <w:rPr>
+          <w:rFonts w:eastAsia="Songti SC" w:cs="Arial Unicode MS" w:ascii="Georgia" w:hAnsi="Georgia"/>
+          <w:b w:val="false"/>
+          <w:bCs w:val="false"/>
+          <w:i w:val="false"/>
+          <w:iCs w:val="false"/>
+          <w:color w:val="auto"/>
+          <w:kern w:val="2"/>
+          <w:sz w:val="14"/>
+          <w:szCs w:val="14"/>
+          <w:u w:val="none"/>
+          <w:lang w:val="en-US" w:eastAsia="zh-CN" w:bidi="hi-IN"/>
+        </w:rPr>
+        <w:t xml:space="preserve">load </w:t>
+      </w:r>
+      <w:r>
+        <w:rPr>
+          <w:rFonts w:eastAsia="Songti SC" w:cs="Arial Unicode MS" w:ascii="Georgia" w:hAnsi="Georgia"/>
+          <w:b w:val="false"/>
+          <w:bCs w:val="false"/>
+          <w:i/>
+          <w:iCs/>
+          <w:color w:val="auto"/>
+          <w:kern w:val="2"/>
+          <w:sz w:val="14"/>
+          <w:szCs w:val="14"/>
+          <w:u w:val="none"/>
+          <w:lang w:val="en-US" w:eastAsia="zh-CN" w:bidi="hi-IN"/>
+        </w:rPr>
+        <w:t>mu</w:t>
+      </w:r>
+      <w:r>
+        <w:rPr>
+          <w:rFonts w:eastAsia="Songti SC" w:cs="Arial Unicode MS" w:ascii="Georgia" w:hAnsi="Georgia"/>
+          <w:b w:val="false"/>
+          <w:bCs w:val="false"/>
+          <w:i w:val="false"/>
+          <w:iCs w:val="false"/>
+          <w:color w:val="auto"/>
+          <w:kern w:val="2"/>
+          <w:sz w:val="14"/>
+          <w:szCs w:val="14"/>
+          <w:u w:val="none"/>
+          <w:lang w:val="en-US" w:eastAsia="zh-CN" w:bidi="hi-IN"/>
+        </w:rPr>
+        <w:t xml:space="preserve"> source</w:t>
       </w:r>
     </w:p>
     <w:p>
@@ -15690,7 +16138,8 @@
           <w:u w:val="none"/>
           <w:lang w:val="en-US" w:eastAsia="zh-CN" w:bidi="hi-IN"/>
         </w:rPr>
-        <w:t xml:space="preserve"> </w:t>
+        <w:tab/>
+        <w:tab/>
       </w:r>
       <w:r>
         <w:rPr>
@@ -15706,9 +16155,7 @@
           <w:u w:val="none"/>
           <w:lang w:val="en-US" w:eastAsia="zh-CN" w:bidi="hi-IN"/>
         </w:rPr>
-        <w:tab/>
-        <w:tab/>
-        <w:t>heap-size</w:t>
+        <w:t>symbols</w:t>
       </w:r>
       <w:r>
         <w:rPr>
@@ -15740,7 +16187,7 @@
           <w:u w:val="none"/>
           <w:lang w:val="en-US" w:eastAsia="zh-CN" w:bidi="hi-IN"/>
         </w:rPr>
-        <w:t>key</w:t>
+        <w:t>ns</w:t>
       </w:r>
       <w:r>
         <w:rPr>
@@ -15757,7 +16204,6 @@
           <w:lang w:val="en-US" w:eastAsia="zh-CN" w:bidi="hi-IN"/>
         </w:rPr>
         <w:tab/>
-        <w:t xml:space="preserve"> </w:t>
       </w:r>
       <w:r>
         <w:rPr>
@@ -15773,16 +16219,15 @@
           <w:u w:val="none"/>
           <w:lang w:val="en-US" w:eastAsia="zh-CN" w:bidi="hi-IN"/>
         </w:rPr>
-        <w:t>fixnum</w:t>
-        <w:tab/>
+        <w:t>list</w:t>
       </w:r>
       <w:r>
         <w:rPr>
           <w:rFonts w:eastAsia="Songti SC" w:cs="Arial Unicode MS" w:ascii="Georgia" w:hAnsi="Georgia"/>
           <w:b w:val="false"/>
           <w:bCs w:val="false"/>
-          <w:i w:val="false"/>
-          <w:iCs w:val="false"/>
+          <w:i/>
+          <w:iCs/>
           <w:color w:val="auto"/>
           <w:kern w:val="2"/>
           <w:sz w:val="14"/>
@@ -15790,17 +16235,11 @@
           <w:u w:val="none"/>
           <w:lang w:val="en-US" w:eastAsia="zh-CN" w:bidi="hi-IN"/>
         </w:rPr>
-        <w:t>type size</w:t>
-      </w:r>
-    </w:p>
-    <w:p>
-      <w:pPr>
-        <w:pStyle w:val="Normal"/>
-        <w:rPr/>
-      </w:pPr>
-      <w:r>
-        <w:rPr>
-          <w:rFonts w:eastAsia="Songti SC" w:cs="Arial Unicode MS" w:ascii="Andale Mono" w:hAnsi="Andale Mono"/>
+        <w:tab/>
+      </w:r>
+      <w:r>
+        <w:rPr>
+          <w:rFonts w:eastAsia="Songti SC" w:cs="Arial Unicode MS" w:ascii="Georgia" w:hAnsi="Georgia"/>
           <w:b w:val="false"/>
           <w:bCs w:val="false"/>
           <w:i/>
@@ -15812,16 +16251,15 @@
           <w:u w:val="none"/>
           <w:lang w:val="en-US" w:eastAsia="zh-CN" w:bidi="hi-IN"/>
         </w:rPr>
-        <w:tab/>
-        <w:tab/>
+        <w:t>ns symbol</w:t>
       </w:r>
       <w:r>
         <w:rPr>
           <w:rFonts w:eastAsia="Songti SC" w:cs="Arial Unicode MS" w:ascii="Georgia" w:hAnsi="Georgia"/>
-          <w:b/>
-          <w:bCs/>
-          <w:i/>
-          <w:iCs/>
+          <w:b w:val="false"/>
+          <w:bCs w:val="false"/>
+          <w:i w:val="false"/>
+          <w:iCs w:val="false"/>
           <w:color w:val="auto"/>
           <w:kern w:val="2"/>
           <w:sz w:val="14"/>
@@ -15829,248 +16267,7 @@
           <w:u w:val="none"/>
           <w:lang w:val="en-US" w:eastAsia="zh-CN" w:bidi="hi-IN"/>
         </w:rPr>
-        <w:t>cache-room</w:t>
-      </w:r>
-      <w:r>
-        <w:rPr>
-          <w:rFonts w:eastAsia="Songti SC" w:cs="Arial Unicode MS" w:ascii="Georgia" w:hAnsi="Georgia"/>
-          <w:b/>
-          <w:bCs/>
-          <w:i w:val="false"/>
-          <w:iCs w:val="false"/>
-          <w:color w:val="auto"/>
-          <w:kern w:val="2"/>
-          <w:sz w:val="14"/>
-          <w:szCs w:val="14"/>
-          <w:u w:val="none"/>
-          <w:lang w:val="en-US" w:eastAsia="zh-CN" w:bidi="hi-IN"/>
-        </w:rPr>
-        <w:tab/>
-      </w:r>
-      <w:r>
-        <w:rPr>
-          <w:rFonts w:eastAsia="Songti SC" w:cs="Arial Unicode MS" w:ascii="Georgia" w:hAnsi="Georgia"/>
-          <w:b w:val="false"/>
-          <w:bCs w:val="false"/>
-          <w:i/>
-          <w:iCs/>
-          <w:color w:val="auto"/>
-          <w:kern w:val="2"/>
-          <w:sz w:val="14"/>
-          <w:szCs w:val="14"/>
-          <w:u w:val="none"/>
-          <w:lang w:val="en-US" w:eastAsia="zh-CN" w:bidi="hi-IN"/>
-        </w:rPr>
-        <w:t>vector</w:t>
-        <w:tab/>
-      </w:r>
-      <w:r>
-        <w:rPr>
-          <w:rFonts w:eastAsia="Songti SC" w:cs="Arial Unicode MS" w:ascii="Georgia" w:hAnsi="Georgia"/>
-          <w:b w:val="false"/>
-          <w:bCs w:val="false"/>
-          <w:i w:val="false"/>
-          <w:iCs w:val="false"/>
-          <w:color w:val="auto"/>
-          <w:kern w:val="2"/>
-          <w:sz w:val="14"/>
-          <w:szCs w:val="14"/>
-          <w:u w:val="none"/>
-          <w:lang w:val="en-US" w:eastAsia="zh-CN" w:bidi="hi-IN"/>
-        </w:rPr>
-        <w:t>allocations</w:t>
-      </w:r>
-    </w:p>
-    <w:p>
-      <w:pPr>
-        <w:pStyle w:val="Normal"/>
-        <w:rPr/>
-      </w:pPr>
-      <w:r>
-        <w:rPr>
-          <w:rFonts w:eastAsia="Songti SC" w:cs="Arial Unicode MS" w:ascii="Courier New" w:hAnsi="Courier New"/>
-          <w:b/>
-          <w:bCs/>
-          <w:i w:val="false"/>
-          <w:iCs w:val="false"/>
-          <w:color w:val="auto"/>
-          <w:kern w:val="2"/>
-          <w:sz w:val="14"/>
-          <w:szCs w:val="14"/>
-          <w:u w:val="none"/>
-          <w:lang w:val="en-US" w:eastAsia="zh-CN" w:bidi="hi-IN"/>
-        </w:rPr>
-        <w:tab/>
-        <w:tab/>
-      </w:r>
-      <w:r>
-        <w:rPr>
-          <w:rFonts w:eastAsia="Songti SC" w:cs="Arial Unicode MS" w:ascii="Courier New" w:hAnsi="Courier New"/>
-          <w:b/>
-          <w:bCs/>
-          <w:i/>
-          <w:iCs/>
-          <w:color w:val="auto"/>
-          <w:kern w:val="2"/>
-          <w:sz w:val="14"/>
-          <w:szCs w:val="14"/>
-          <w:u w:val="none"/>
-          <w:lang w:val="en-US" w:eastAsia="zh-CN" w:bidi="hi-IN"/>
-        </w:rPr>
-        <w:t xml:space="preserve">    </w:t>
-      </w:r>
-      <w:r>
-        <w:rPr>
-          <w:rFonts w:eastAsia="Songti SC" w:cs="Arial Unicode MS" w:ascii="Andale Mono" w:hAnsi="Andale Mono"/>
-          <w:b w:val="false"/>
-          <w:bCs w:val="false"/>
-          <w:i/>
-          <w:iCs/>
-          <w:color w:val="auto"/>
-          <w:kern w:val="2"/>
-          <w:sz w:val="14"/>
-          <w:szCs w:val="14"/>
-          <w:u w:val="none"/>
-          <w:lang w:val="en-US" w:eastAsia="zh-CN" w:bidi="hi-IN"/>
-        </w:rPr>
-        <w:t>#(:t size total …)</w:t>
-      </w:r>
-    </w:p>
-    <w:p>
-      <w:pPr>
-        <w:pStyle w:val="Normal"/>
-        <w:rPr/>
-      </w:pPr>
-      <w:r>
-        <w:rPr>
-          <w:rFonts w:eastAsia="Songti SC" w:cs="Arial Unicode MS" w:ascii="Georgia" w:hAnsi="Georgia"/>
-          <w:b/>
-          <w:bCs/>
-          <w:i/>
-          <w:iCs/>
-          <w:color w:val="auto"/>
-          <w:kern w:val="2"/>
-          <w:sz w:val="14"/>
-          <w:szCs w:val="14"/>
-          <w:u w:val="none"/>
-          <w:lang w:val="en-US" w:eastAsia="zh-CN" w:bidi="hi-IN"/>
-        </w:rPr>
-        <w:tab/>
-        <w:tab/>
-        <w:t>load</w:t>
-      </w:r>
-      <w:r>
-        <w:rPr>
-          <w:rFonts w:eastAsia="Songti SC" w:cs="Arial Unicode MS" w:ascii="Georgia" w:hAnsi="Georgia"/>
-          <w:b/>
-          <w:bCs/>
-          <w:i w:val="false"/>
-          <w:iCs w:val="false"/>
-          <w:color w:val="auto"/>
-          <w:kern w:val="2"/>
-          <w:sz w:val="14"/>
-          <w:szCs w:val="14"/>
-          <w:u w:val="none"/>
-          <w:lang w:val="en-US" w:eastAsia="zh-CN" w:bidi="hi-IN"/>
-        </w:rPr>
-        <w:t xml:space="preserve"> </w:t>
-      </w:r>
-      <w:r>
-        <w:rPr>
-          <w:rFonts w:eastAsia="Songti SC" w:cs="Arial Unicode MS" w:ascii="Georgia" w:hAnsi="Georgia"/>
-          <w:b w:val="false"/>
-          <w:bCs w:val="false"/>
-          <w:i/>
-          <w:iCs/>
-          <w:color w:val="auto"/>
-          <w:kern w:val="2"/>
-          <w:sz w:val="14"/>
-          <w:szCs w:val="14"/>
-          <w:u w:val="none"/>
-          <w:lang w:val="en-US" w:eastAsia="zh-CN" w:bidi="hi-IN"/>
-        </w:rPr>
-        <w:t>string</w:t>
-      </w:r>
-      <w:r>
-        <w:rPr>
-          <w:rFonts w:eastAsia="Songti SC" w:cs="Arial Unicode MS" w:ascii="Georgia" w:hAnsi="Georgia"/>
-          <w:b/>
-          <w:bCs/>
-          <w:i w:val="false"/>
-          <w:iCs w:val="false"/>
-          <w:color w:val="auto"/>
-          <w:kern w:val="2"/>
-          <w:sz w:val="14"/>
-          <w:szCs w:val="14"/>
-          <w:u w:val="none"/>
-          <w:lang w:val="en-US" w:eastAsia="zh-CN" w:bidi="hi-IN"/>
-        </w:rPr>
-        <w:tab/>
-      </w:r>
-      <w:r>
-        <w:rPr>
-          <w:rFonts w:eastAsia="Songti SC" w:cs="Arial Unicode MS" w:ascii="Georgia" w:hAnsi="Georgia"/>
-          <w:b w:val="false"/>
-          <w:bCs w:val="false"/>
-          <w:i/>
-          <w:iCs/>
-          <w:color w:val="auto"/>
-          <w:kern w:val="2"/>
-          <w:sz w:val="14"/>
-          <w:szCs w:val="14"/>
-          <w:u w:val="none"/>
-          <w:lang w:val="en-US" w:eastAsia="zh-CN" w:bidi="hi-IN"/>
-        </w:rPr>
-        <w:t>bool</w:t>
-        <w:tab/>
-      </w:r>
-      <w:r>
-        <w:rPr>
-          <w:rFonts w:eastAsia="Songti SC" w:cs="Arial Unicode MS" w:ascii="Georgia" w:hAnsi="Georgia"/>
-          <w:b w:val="false"/>
-          <w:bCs w:val="false"/>
-          <w:i w:val="false"/>
-          <w:iCs w:val="false"/>
-          <w:color w:val="auto"/>
-          <w:kern w:val="2"/>
-          <w:sz w:val="14"/>
-          <w:szCs w:val="14"/>
-          <w:u w:val="none"/>
-          <w:lang w:val="en-US" w:eastAsia="zh-CN" w:bidi="hi-IN"/>
-        </w:rPr>
-        <w:t xml:space="preserve">load </w:t>
-      </w:r>
-      <w:r>
-        <w:rPr>
-          <w:rFonts w:eastAsia="Songti SC" w:cs="Arial Unicode MS" w:ascii="Georgia" w:hAnsi="Georgia"/>
-          <w:b w:val="false"/>
-          <w:bCs w:val="false"/>
-          <w:i/>
-          <w:iCs/>
-          <w:color w:val="auto"/>
-          <w:kern w:val="2"/>
-          <w:sz w:val="14"/>
-          <w:szCs w:val="14"/>
-          <w:u w:val="none"/>
-          <w:lang w:val="en-US" w:eastAsia="zh-CN" w:bidi="hi-IN"/>
-        </w:rPr>
-        <w:t>mu</w:t>
-      </w:r>
-      <w:r>
-        <w:rPr>
-          <w:rFonts w:eastAsia="Songti SC" w:cs="Arial Unicode MS" w:ascii="Georgia" w:hAnsi="Georgia"/>
-          <w:b w:val="false"/>
-          <w:bCs w:val="false"/>
-          <w:i w:val="false"/>
-          <w:iCs w:val="false"/>
-          <w:color w:val="auto"/>
-          <w:kern w:val="2"/>
-          <w:sz w:val="14"/>
-          <w:szCs w:val="14"/>
-          <w:u w:val="none"/>
-          <w:lang w:val="en-US" w:eastAsia="zh-CN" w:bidi="hi-IN"/>
-        </w:rPr>
-        <w:t xml:space="preserve"> source</w:t>
+        <w:t xml:space="preserve"> list</w:t>
       </w:r>
     </w:p>
     <w:p>
@@ -17142,7 +17339,11 @@
         </w:rPr>
       </w:pPr>
       <w:r>
-        <w:rPr/>
+        <w:rPr>
+          <w:rFonts w:ascii="Georgia" w:hAnsi="Georgia"/>
+          <w:sz w:val="14"/>
+          <w:szCs w:val="14"/>
+        </w:rPr>
       </w:r>
     </w:p>
     <w:p>
@@ -23581,7 +23782,7 @@
     <w:pPr>
       <w:widowControl/>
       <w:suppressAutoHyphens w:val="true"/>
-      <w:overflowPunct w:val="false"/>
+      <w:overflowPunct w:val="true"/>
       <w:bidi w:val="0"/>
       <w:spacing w:before="0" w:after="0"/>
       <w:jc w:val="left"/>

</xml_diff>

<commit_message>
#1093 - describe: improve formatting
</commit_message>
<xml_diff>
--- a/doc/refcards/mu-ref.docx
+++ b/doc/refcards/mu-ref.docx
@@ -3646,14 +3646,28 @@
           <w:rFonts w:ascii="Georgia" w:hAnsi="Georgia"/>
           <w:b/>
           <w:bCs/>
-          <w:i/>
+          <w:i w:val="false"/>
           <w:iCs/>
           <w:color w:val="FFFFFF"/>
           <w:sz w:val="20"/>
           <w:szCs w:val="20"/>
           <w:shd w:fill="333333" w:val="clear"/>
         </w:rPr>
-        <w:t>Special forms</w:t>
+        <w:t>s</w:t>
+      </w:r>
+      <w:r>
+        <w:rPr>
+          <w:rFonts w:ascii="Georgia" w:hAnsi="Georgia"/>
+          <w:b/>
+          <w:bCs/>
+          <w:i/>
+          <w:iCs/>
+          <w:color w:val="FFFFFF"/>
+          <w:sz w:val="20"/>
+          <w:szCs w:val="20"/>
+          <w:shd w:fill="333333" w:val="clear"/>
+        </w:rPr>
+        <w:t>pecial forms</w:t>
       </w:r>
       <w:r>
         <w:rPr>
@@ -4153,7 +4167,17 @@
         <w:tab/>
         <w:t>T</w:t>
         <w:tab/>
-        <w:t>Georg</w:t>
+      </w:r>
+      <w:r>
+        <w:rPr>
+          <w:rFonts w:ascii="Georgia" w:hAnsi="Georgia"/>
+          <w:bCs/>
+          <w:i w:val="false"/>
+          <w:iCs w:val="false"/>
+          <w:sz w:val="16"/>
+          <w:szCs w:val="16"/>
+        </w:rPr>
+        <w:t>conditional</w:t>
       </w:r>
     </w:p>
     <w:p>
@@ -4283,12 +4307,14 @@
       <w:pPr>
         <w:pStyle w:val="Normal"/>
         <w:rPr>
+          <w:rFonts w:ascii="Georgia" w:hAnsi="Georgia"/>
           <w:sz w:val="12"/>
           <w:szCs w:val="12"/>
         </w:rPr>
       </w:pPr>
       <w:r>
         <w:rPr>
+          <w:rFonts w:ascii="Georgia" w:hAnsi="Georgia"/>
           <w:sz w:val="12"/>
           <w:szCs w:val="12"/>
         </w:rPr>
@@ -4925,6 +4951,7 @@
       <w:pPr>
         <w:pStyle w:val="Normal"/>
         <w:rPr>
+          <w:rFonts w:ascii="Georgia" w:hAnsi="Georgia"/>
           <w:b/>
           <w:bCs/>
           <w:sz w:val="12"/>
@@ -4933,6 +4960,7 @@
       </w:pPr>
       <w:r>
         <w:rPr>
+          <w:rFonts w:ascii="Georgia" w:hAnsi="Georgia"/>
           <w:b/>
           <w:bCs/>
           <w:sz w:val="12"/>
@@ -6888,12 +6916,14 @@
       <w:pPr>
         <w:pStyle w:val="Normal"/>
         <w:rPr>
+          <w:rFonts w:ascii="Georgia" w:hAnsi="Georgia"/>
           <w:sz w:val="12"/>
           <w:szCs w:val="12"/>
         </w:rPr>
       </w:pPr>
       <w:r>
         <w:rPr>
+          <w:rFonts w:ascii="Georgia" w:hAnsi="Georgia"/>
           <w:sz w:val="12"/>
           <w:szCs w:val="12"/>
         </w:rPr>
@@ -8768,14 +8798,16 @@
       <w:pPr>
         <w:pStyle w:val="Normal"/>
         <w:rPr>
-          <w:sz w:val="16"/>
-          <w:szCs w:val="16"/>
-        </w:rPr>
-      </w:pPr>
-      <w:r>
-        <w:rPr>
-          <w:sz w:val="16"/>
-          <w:szCs w:val="16"/>
+          <w:rFonts w:ascii="Georgia" w:hAnsi="Georgia"/>
+          <w:sz w:val="12"/>
+          <w:szCs w:val="12"/>
+        </w:rPr>
+      </w:pPr>
+      <w:r>
+        <w:rPr>
+          <w:rFonts w:ascii="Georgia" w:hAnsi="Georgia"/>
+          <w:sz w:val="12"/>
+          <w:szCs w:val="12"/>
         </w:rPr>
       </w:r>
     </w:p>
@@ -10449,14 +10481,16 @@
       <w:pPr>
         <w:pStyle w:val="Normal"/>
         <w:rPr>
-          <w:sz w:val="16"/>
-          <w:szCs w:val="16"/>
-        </w:rPr>
-      </w:pPr>
-      <w:r>
-        <w:rPr>
-          <w:sz w:val="16"/>
-          <w:szCs w:val="16"/>
+          <w:rFonts w:ascii="Georgia" w:hAnsi="Georgia"/>
+          <w:sz w:val="12"/>
+          <w:szCs w:val="12"/>
+        </w:rPr>
+      </w:pPr>
+      <w:r>
+        <w:rPr>
+          <w:rFonts w:ascii="Georgia" w:hAnsi="Georgia"/>
+          <w:sz w:val="12"/>
+          <w:szCs w:val="12"/>
         </w:rPr>
       </w:r>
     </w:p>
@@ -10927,14 +10961,16 @@
       <w:pPr>
         <w:pStyle w:val="Normal"/>
         <w:rPr>
-          <w:sz w:val="16"/>
-          <w:szCs w:val="16"/>
-        </w:rPr>
-      </w:pPr>
-      <w:r>
-        <w:rPr>
-          <w:sz w:val="16"/>
-          <w:szCs w:val="16"/>
+          <w:rFonts w:ascii="Georgia" w:hAnsi="Georgia"/>
+          <w:sz w:val="12"/>
+          <w:szCs w:val="12"/>
+        </w:rPr>
+      </w:pPr>
+      <w:r>
+        <w:rPr>
+          <w:rFonts w:ascii="Georgia" w:hAnsi="Georgia"/>
+          <w:sz w:val="12"/>
+          <w:szCs w:val="12"/>
         </w:rPr>
       </w:r>
     </w:p>
@@ -13387,6 +13423,21 @@
       <w:pPr>
         <w:pStyle w:val="Normal"/>
         <w:rPr>
+          <w:sz w:val="12"/>
+          <w:szCs w:val="12"/>
+        </w:rPr>
+      </w:pPr>
+      <w:r>
+        <w:rPr>
+          <w:sz w:val="12"/>
+          <w:szCs w:val="12"/>
+        </w:rPr>
+      </w:r>
+    </w:p>
+    <w:p>
+      <w:pPr>
+        <w:pStyle w:val="Normal"/>
+        <w:rPr>
           <w:rFonts w:ascii="Georgia" w:hAnsi="Georgia"/>
           <w:sz w:val="20"/>
           <w:szCs w:val="20"/>
@@ -14788,15 +14839,15 @@
           <w:u w:val="none"/>
           <w:lang w:val="en-US" w:eastAsia="zh-CN" w:bidi="hi-IN"/>
         </w:rPr>
-        <w:t>core-</w:t>
+        <w:t>core-info</w:t>
       </w:r>
       <w:r>
         <w:rPr>
           <w:rFonts w:eastAsia="Songti SC" w:cs="Arial Unicode MS" w:ascii="Georgia" w:hAnsi="Georgia"/>
-          <w:b/>
-          <w:bCs/>
-          <w:i/>
-          <w:iCs/>
+          <w:b w:val="false"/>
+          <w:bCs w:val="false"/>
+          <w:i w:val="false"/>
+          <w:iCs w:val="false"/>
           <w:color w:val="auto"/>
           <w:kern w:val="2"/>
           <w:sz w:val="14"/>
@@ -14804,15 +14855,16 @@
           <w:u w:val="none"/>
           <w:lang w:val="en-US" w:eastAsia="zh-CN" w:bidi="hi-IN"/>
         </w:rPr>
-        <w:t>info</w:t>
+        <w:tab/>
+        <w:tab/>
       </w:r>
       <w:r>
         <w:rPr>
           <w:rFonts w:eastAsia="Songti SC" w:cs="Arial Unicode MS" w:ascii="Georgia" w:hAnsi="Georgia"/>
           <w:b w:val="false"/>
           <w:bCs w:val="false"/>
-          <w:i w:val="false"/>
-          <w:iCs w:val="false"/>
+          <w:i/>
+          <w:iCs/>
           <w:color w:val="auto"/>
           <w:kern w:val="2"/>
           <w:sz w:val="14"/>
@@ -14820,7 +14872,7 @@
           <w:u w:val="none"/>
           <w:lang w:val="en-US" w:eastAsia="zh-CN" w:bidi="hi-IN"/>
         </w:rPr>
-        <w:tab/>
+        <w:t>list</w:t>
         <w:tab/>
       </w:r>
       <w:r>
@@ -14828,8 +14880,8 @@
           <w:rFonts w:eastAsia="Songti SC" w:cs="Arial Unicode MS" w:ascii="Georgia" w:hAnsi="Georgia"/>
           <w:b w:val="false"/>
           <w:bCs w:val="false"/>
-          <w:i/>
-          <w:iCs/>
+          <w:i w:val="false"/>
+          <w:iCs w:val="false"/>
           <w:color w:val="auto"/>
           <w:kern w:val="2"/>
           <w:sz w:val="14"/>
@@ -14837,6 +14889,128 @@
           <w:u w:val="none"/>
           <w:lang w:val="en-US" w:eastAsia="zh-CN" w:bidi="hi-IN"/>
         </w:rPr>
+        <w:t>core</w:t>
+      </w:r>
+      <w:r>
+        <w:rPr>
+          <w:rFonts w:eastAsia="Songti SC" w:cs="Arial Unicode MS" w:ascii="Georgia" w:hAnsi="Georgia"/>
+          <w:b w:val="false"/>
+          <w:bCs w:val="false"/>
+          <w:i/>
+          <w:iCs/>
+          <w:color w:val="auto"/>
+          <w:kern w:val="2"/>
+          <w:sz w:val="14"/>
+          <w:szCs w:val="14"/>
+          <w:u w:val="none"/>
+          <w:lang w:val="en-US" w:eastAsia="zh-CN" w:bidi="hi-IN"/>
+        </w:rPr>
+        <w:t xml:space="preserve"> </w:t>
+      </w:r>
+      <w:r>
+        <w:rPr>
+          <w:rFonts w:eastAsia="Songti SC" w:cs="Arial Unicode MS" w:ascii="Georgia" w:hAnsi="Georgia"/>
+          <w:b w:val="false"/>
+          <w:bCs w:val="false"/>
+          <w:i w:val="false"/>
+          <w:iCs w:val="false"/>
+          <w:color w:val="auto"/>
+          <w:kern w:val="2"/>
+          <w:sz w:val="14"/>
+          <w:szCs w:val="14"/>
+          <w:u w:val="none"/>
+          <w:lang w:val="en-US" w:eastAsia="zh-CN" w:bidi="hi-IN"/>
+        </w:rPr>
+        <w:t>state</w:t>
+      </w:r>
+    </w:p>
+    <w:p>
+      <w:pPr>
+        <w:pStyle w:val="Normal"/>
+        <w:rPr>
+          <w:sz w:val="16"/>
+          <w:szCs w:val="16"/>
+        </w:rPr>
+      </w:pPr>
+      <w:r>
+        <w:rPr>
+          <w:rFonts w:eastAsia="Songti SC" w:cs="Arial Unicode MS" w:ascii="Georgia" w:hAnsi="Georgia"/>
+          <w:b/>
+          <w:bCs/>
+          <w:i w:val="false"/>
+          <w:iCs w:val="false"/>
+          <w:color w:val="auto"/>
+          <w:kern w:val="2"/>
+          <w:sz w:val="16"/>
+          <w:szCs w:val="16"/>
+          <w:u w:val="none"/>
+          <w:lang w:val="en-US" w:eastAsia="zh-CN" w:bidi="hi-IN"/>
+        </w:rPr>
+        <w:t xml:space="preserve">   </w:t>
+      </w:r>
+      <w:r>
+        <w:rPr>
+          <w:rFonts w:eastAsia="Songti SC" w:cs="Arial Unicode MS" w:ascii="Georgia" w:hAnsi="Georgia"/>
+          <w:b/>
+          <w:bCs/>
+          <w:i w:val="false"/>
+          <w:iCs w:val="false"/>
+          <w:color w:val="auto"/>
+          <w:kern w:val="2"/>
+          <w:sz w:val="16"/>
+          <w:szCs w:val="16"/>
+          <w:u w:val="none"/>
+          <w:lang w:val="en-US" w:eastAsia="zh-CN" w:bidi="hi-IN"/>
+        </w:rPr>
+        <w:tab/>
+        <w:tab/>
+      </w:r>
+      <w:r>
+        <w:rPr>
+          <w:rFonts w:eastAsia="Songti SC" w:cs="Arial Unicode MS" w:ascii="Georgia" w:hAnsi="Georgia"/>
+          <w:b/>
+          <w:bCs/>
+          <w:i/>
+          <w:iCs/>
+          <w:color w:val="auto"/>
+          <w:kern w:val="2"/>
+          <w:sz w:val="14"/>
+          <w:szCs w:val="14"/>
+          <w:u w:val="none"/>
+          <w:lang w:val="en-US" w:eastAsia="zh-CN" w:bidi="hi-IN"/>
+        </w:rPr>
+        <w:t xml:space="preserve">process-fds </w:t>
+      </w:r>
+      <w:r>
+        <w:rPr>
+          <w:rFonts w:eastAsia="Songti SC" w:cs="Arial Unicode MS" w:ascii="Georgia" w:hAnsi="Georgia"/>
+          <w:b w:val="false"/>
+          <w:bCs w:val="false"/>
+          <w:i/>
+          <w:iCs/>
+          <w:color w:val="auto"/>
+          <w:kern w:val="2"/>
+          <w:sz w:val="14"/>
+          <w:szCs w:val="14"/>
+          <w:u w:val="none"/>
+          <w:lang w:val="en-US" w:eastAsia="zh-CN" w:bidi="hi-IN"/>
+        </w:rPr>
+        <w:tab/>
+      </w:r>
+      <w:r>
+        <w:rPr>
+          <w:rFonts w:eastAsia="Songti SC" w:cs="Arial Unicode MS" w:ascii="Georgia" w:hAnsi="Georgia"/>
+          <w:b w:val="false"/>
+          <w:bCs w:val="false"/>
+          <w:i/>
+          <w:iCs/>
+          <w:color w:val="auto"/>
+          <w:kern w:val="2"/>
+          <w:sz w:val="16"/>
+          <w:szCs w:val="16"/>
+          <w:u w:val="none"/>
+          <w:lang w:val="en-US" w:eastAsia="zh-CN" w:bidi="hi-IN"/>
+        </w:rPr>
         <w:t>list</w:t>
         <w:tab/>
       </w:r>
@@ -14845,8 +15019,8 @@
           <w:rFonts w:eastAsia="Songti SC" w:cs="Arial Unicode MS" w:ascii="Georgia" w:hAnsi="Georgia"/>
           <w:b w:val="false"/>
           <w:bCs w:val="false"/>
-          <w:i w:val="false"/>
-          <w:iCs w:val="false"/>
+          <w:i/>
+          <w:iCs/>
           <w:color w:val="auto"/>
           <w:kern w:val="2"/>
           <w:sz w:val="14"/>
@@ -14854,485 +15028,318 @@
           <w:u w:val="none"/>
           <w:lang w:val="en-US" w:eastAsia="zh-CN" w:bidi="hi-IN"/>
         </w:rPr>
-        <w:t>core</w:t>
-      </w:r>
+        <w:t>file descriptors</w:t>
+      </w:r>
+    </w:p>
+    <w:p>
+      <w:pPr>
+        <w:pStyle w:val="Normal"/>
+        <w:rPr/>
+      </w:pPr>
+      <w:r>
+        <w:rPr>
+          <w:rFonts w:ascii="Georgia" w:hAnsi="Georgia"/>
+          <w:sz w:val="14"/>
+          <w:szCs w:val="14"/>
+        </w:rPr>
+        <w:t xml:space="preserve"> </w:t>
+      </w:r>
+      <w:r>
+        <w:rPr>
+          <w:rFonts w:ascii="Georgia" w:hAnsi="Georgia"/>
+          <w:b/>
+          <w:bCs/>
+          <w:sz w:val="14"/>
+          <w:szCs w:val="14"/>
+        </w:rPr>
+        <w:tab/>
+        <w:tab/>
+      </w:r>
+      <w:r>
+        <w:rPr>
+          <w:rFonts w:ascii="Georgia" w:hAnsi="Georgia"/>
+          <w:b/>
+          <w:bCs/>
+          <w:i/>
+          <w:iCs/>
+          <w:sz w:val="14"/>
+          <w:szCs w:val="14"/>
+        </w:rPr>
+        <w:t>process-mem-virt</w:t>
+      </w:r>
+      <w:r>
+        <w:rPr>
+          <w:rFonts w:ascii="Georgia" w:hAnsi="Georgia"/>
+          <w:b/>
+          <w:bCs/>
+          <w:sz w:val="14"/>
+          <w:szCs w:val="14"/>
+        </w:rPr>
+        <w:tab/>
+      </w:r>
+      <w:r>
+        <w:rPr>
+          <w:rFonts w:ascii="Georgia" w:hAnsi="Georgia"/>
+          <w:b w:val="false"/>
+          <w:bCs w:val="false"/>
+          <w:i/>
+          <w:iCs/>
+          <w:sz w:val="14"/>
+          <w:szCs w:val="14"/>
+        </w:rPr>
+        <w:t>fixnum</w:t>
+        <w:tab/>
+      </w:r>
+      <w:r>
+        <w:rPr>
+          <w:rFonts w:ascii="Georgia" w:hAnsi="Georgia"/>
+          <w:b w:val="false"/>
+          <w:bCs w:val="false"/>
+          <w:i w:val="false"/>
+          <w:iCs w:val="false"/>
+          <w:sz w:val="14"/>
+          <w:szCs w:val="14"/>
+        </w:rPr>
+        <w:t>vmem</w:t>
+      </w:r>
+    </w:p>
+    <w:p>
+      <w:pPr>
+        <w:pStyle w:val="Normal"/>
+        <w:rPr/>
+      </w:pPr>
+      <w:r>
+        <w:rPr>
+          <w:rFonts w:ascii="Georgia" w:hAnsi="Georgia"/>
+          <w:b/>
+          <w:bCs/>
+          <w:sz w:val="14"/>
+          <w:szCs w:val="14"/>
+        </w:rPr>
+        <w:tab/>
+        <w:tab/>
+      </w:r>
+      <w:r>
+        <w:rPr>
+          <w:rFonts w:ascii="Georgia" w:hAnsi="Georgia"/>
+          <w:b/>
+          <w:bCs/>
+          <w:i/>
+          <w:iCs/>
+          <w:sz w:val="14"/>
+          <w:szCs w:val="14"/>
+        </w:rPr>
+        <w:t>process-mem-res</w:t>
+      </w:r>
+      <w:r>
+        <w:rPr>
+          <w:rFonts w:ascii="Georgia" w:hAnsi="Georgia"/>
+          <w:b/>
+          <w:bCs/>
+          <w:sz w:val="14"/>
+          <w:szCs w:val="14"/>
+        </w:rPr>
+        <w:tab/>
+      </w:r>
+      <w:r>
+        <w:rPr>
+          <w:rFonts w:ascii="Georgia" w:hAnsi="Georgia"/>
+          <w:b w:val="false"/>
+          <w:bCs w:val="false"/>
+          <w:i/>
+          <w:iCs/>
+          <w:sz w:val="14"/>
+          <w:szCs w:val="14"/>
+        </w:rPr>
+        <w:t>fixnum</w:t>
+        <w:tab/>
+      </w:r>
+      <w:r>
+        <w:rPr>
+          <w:rFonts w:ascii="Georgia" w:hAnsi="Georgia"/>
+          <w:b w:val="false"/>
+          <w:bCs w:val="false"/>
+          <w:i w:val="false"/>
+          <w:iCs w:val="false"/>
+          <w:sz w:val="14"/>
+          <w:szCs w:val="14"/>
+        </w:rPr>
+        <w:t>reserve</w:t>
+      </w:r>
+    </w:p>
+    <w:p>
+      <w:pPr>
+        <w:pStyle w:val="Normal"/>
+        <w:rPr/>
+      </w:pPr>
+      <w:r>
+        <w:rPr>
+          <w:rFonts w:ascii="Georgia" w:hAnsi="Georgia"/>
+          <w:b/>
+          <w:bCs/>
+          <w:sz w:val="14"/>
+          <w:szCs w:val="14"/>
+        </w:rPr>
+        <w:tab/>
+        <w:tab/>
+      </w:r>
+      <w:r>
+        <w:rPr>
+          <w:rFonts w:ascii="Georgia" w:hAnsi="Georgia"/>
+          <w:b/>
+          <w:bCs/>
+          <w:i/>
+          <w:iCs/>
+          <w:sz w:val="14"/>
+          <w:szCs w:val="14"/>
+        </w:rPr>
+        <w:t>process-time</w:t>
+      </w:r>
+      <w:r>
+        <w:rPr>
+          <w:rFonts w:ascii="Georgia" w:hAnsi="Georgia"/>
+          <w:b/>
+          <w:bCs/>
+          <w:sz w:val="14"/>
+          <w:szCs w:val="14"/>
+        </w:rPr>
+        <w:tab/>
+      </w:r>
+      <w:r>
+        <w:rPr>
+          <w:rFonts w:ascii="Georgia" w:hAnsi="Georgia"/>
+          <w:b w:val="false"/>
+          <w:bCs w:val="false"/>
+          <w:i/>
+          <w:iCs/>
+          <w:sz w:val="14"/>
+          <w:szCs w:val="14"/>
+        </w:rPr>
+        <w:t>fixnum</w:t>
+        <w:tab/>
+      </w:r>
+      <w:r>
+        <w:rPr>
+          <w:rFonts w:ascii="Georgia" w:hAnsi="Georgia"/>
+          <w:b w:val="false"/>
+          <w:bCs w:val="false"/>
+          <w:i w:val="false"/>
+          <w:iCs w:val="false"/>
+          <w:sz w:val="14"/>
+          <w:szCs w:val="14"/>
+        </w:rPr>
+        <w:t>microseconds</w:t>
+      </w:r>
+    </w:p>
+    <w:p>
+      <w:pPr>
+        <w:pStyle w:val="Normal"/>
+        <w:rPr/>
+      </w:pPr>
+      <w:r>
+        <w:rPr>
+          <w:b/>
+          <w:bCs/>
+        </w:rPr>
+        <w:t xml:space="preserve"> </w:t>
+      </w:r>
+      <w:r>
+        <w:rPr>
+          <w:b/>
+          <w:bCs/>
+        </w:rPr>
+        <w:tab/>
+        <w:tab/>
+      </w:r>
+      <w:r>
+        <w:rPr>
+          <w:rFonts w:ascii="Georgia" w:hAnsi="Georgia"/>
+          <w:b/>
+          <w:bCs/>
+          <w:i/>
+          <w:iCs/>
+          <w:sz w:val="14"/>
+          <w:szCs w:val="14"/>
+        </w:rPr>
+        <w:t>time-units-per-sec</w:t>
+      </w:r>
+      <w:r>
+        <w:rPr>
+          <w:rFonts w:ascii="Georgia" w:hAnsi="Georgia"/>
+          <w:b/>
+          <w:bCs/>
+          <w:sz w:val="14"/>
+          <w:szCs w:val="14"/>
+        </w:rPr>
+        <w:tab/>
+      </w:r>
+      <w:r>
+        <w:rPr>
+          <w:rFonts w:ascii="Georgia" w:hAnsi="Georgia"/>
+          <w:i/>
+          <w:iCs/>
+          <w:sz w:val="14"/>
+          <w:szCs w:val="14"/>
+        </w:rPr>
+        <w:t>fixnum</w:t>
+      </w:r>
+    </w:p>
+    <w:p>
+      <w:pPr>
+        <w:pStyle w:val="Normal"/>
+        <w:rPr>
+          <w:sz w:val="16"/>
+          <w:szCs w:val="16"/>
+        </w:rPr>
+      </w:pPr>
       <w:r>
         <w:rPr>
           <w:rFonts w:eastAsia="Songti SC" w:cs="Arial Unicode MS" w:ascii="Georgia" w:hAnsi="Georgia"/>
-          <w:b w:val="false"/>
-          <w:bCs w:val="false"/>
-          <w:i/>
-          <w:iCs/>
+          <w:b/>
+          <w:bCs/>
+          <w:i w:val="false"/>
+          <w:iCs w:val="false"/>
           <w:color w:val="auto"/>
           <w:kern w:val="2"/>
-          <w:sz w:val="14"/>
-          <w:szCs w:val="14"/>
+          <w:sz w:val="16"/>
+          <w:szCs w:val="16"/>
           <w:u w:val="none"/>
           <w:lang w:val="en-US" w:eastAsia="zh-CN" w:bidi="hi-IN"/>
         </w:rPr>
-        <w:t xml:space="preserve"> </w:t>
+        <w:t xml:space="preserve">   </w:t>
       </w:r>
       <w:r>
         <w:rPr>
           <w:rFonts w:eastAsia="Songti SC" w:cs="Arial Unicode MS" w:ascii="Georgia" w:hAnsi="Georgia"/>
-          <w:b w:val="false"/>
-          <w:bCs w:val="false"/>
+          <w:b/>
+          <w:bCs/>
           <w:i w:val="false"/>
           <w:iCs w:val="false"/>
           <w:color w:val="auto"/>
           <w:kern w:val="2"/>
-          <w:sz w:val="14"/>
-          <w:szCs w:val="14"/>
+          <w:sz w:val="16"/>
+          <w:szCs w:val="16"/>
           <w:u w:val="none"/>
           <w:lang w:val="en-US" w:eastAsia="zh-CN" w:bidi="hi-IN"/>
         </w:rPr>
-        <w:t>state</w:t>
-      </w:r>
-    </w:p>
-    <w:p>
-      <w:pPr>
-        <w:pStyle w:val="Normal"/>
-        <w:rPr/>
-      </w:pPr>
-      <w:r>
-        <w:rPr>
-          <w:rFonts w:ascii="Georgia" w:hAnsi="Georgia"/>
-          <w:sz w:val="14"/>
-          <w:szCs w:val="14"/>
-        </w:rPr>
-        <w:t xml:space="preserve"> </w:t>
-      </w:r>
-      <w:r>
-        <w:rPr>
-          <w:rFonts w:ascii="Georgia" w:hAnsi="Georgia"/>
-          <w:b/>
-          <w:bCs/>
-          <w:sz w:val="14"/>
-          <w:szCs w:val="14"/>
-        </w:rPr>
-        <w:tab/>
-        <w:tab/>
-      </w:r>
-      <w:r>
-        <w:rPr>
-          <w:rFonts w:ascii="Georgia" w:hAnsi="Georgia"/>
-          <w:b/>
-          <w:bCs/>
-          <w:i/>
-          <w:iCs/>
-          <w:sz w:val="14"/>
-          <w:szCs w:val="14"/>
-        </w:rPr>
-        <w:t>process-mem-virt</w:t>
-      </w:r>
-      <w:r>
-        <w:rPr>
-          <w:rFonts w:ascii="Georgia" w:hAnsi="Georgia"/>
-          <w:b/>
-          <w:bCs/>
-          <w:sz w:val="14"/>
-          <w:szCs w:val="14"/>
-        </w:rPr>
-        <w:tab/>
-      </w:r>
-      <w:r>
-        <w:rPr>
-          <w:rFonts w:ascii="Georgia" w:hAnsi="Georgia"/>
-          <w:b w:val="false"/>
-          <w:bCs w:val="false"/>
-          <w:i/>
-          <w:iCs/>
-          <w:sz w:val="14"/>
-          <w:szCs w:val="14"/>
-        </w:rPr>
-        <w:t>fixnum</w:t>
-        <w:tab/>
-      </w:r>
-      <w:r>
-        <w:rPr>
-          <w:rFonts w:ascii="Georgia" w:hAnsi="Georgia"/>
-          <w:b w:val="false"/>
-          <w:bCs w:val="false"/>
-          <w:i w:val="false"/>
-          <w:iCs w:val="false"/>
-          <w:sz w:val="14"/>
-          <w:szCs w:val="14"/>
-        </w:rPr>
-        <w:t>vmem</w:t>
-      </w:r>
-    </w:p>
-    <w:p>
-      <w:pPr>
-        <w:pStyle w:val="Normal"/>
-        <w:rPr/>
-      </w:pPr>
-      <w:r>
-        <w:rPr>
-          <w:rFonts w:ascii="Georgia" w:hAnsi="Georgia"/>
-          <w:b/>
-          <w:bCs/>
-          <w:sz w:val="14"/>
-          <w:szCs w:val="14"/>
-        </w:rPr>
-        <w:tab/>
-        <w:tab/>
-      </w:r>
-      <w:r>
-        <w:rPr>
-          <w:rFonts w:ascii="Georgia" w:hAnsi="Georgia"/>
-          <w:b/>
-          <w:bCs/>
-          <w:i/>
-          <w:iCs/>
-          <w:sz w:val="14"/>
-          <w:szCs w:val="14"/>
-        </w:rPr>
-        <w:t>process-mem-res</w:t>
-      </w:r>
-      <w:r>
-        <w:rPr>
-          <w:rFonts w:ascii="Georgia" w:hAnsi="Georgia"/>
-          <w:b/>
-          <w:bCs/>
-          <w:sz w:val="14"/>
-          <w:szCs w:val="14"/>
-        </w:rPr>
-        <w:tab/>
-      </w:r>
-      <w:r>
-        <w:rPr>
-          <w:rFonts w:ascii="Georgia" w:hAnsi="Georgia"/>
-          <w:b w:val="false"/>
-          <w:bCs w:val="false"/>
-          <w:i/>
-          <w:iCs/>
-          <w:sz w:val="14"/>
-          <w:szCs w:val="14"/>
-        </w:rPr>
-        <w:t>fixnum</w:t>
-        <w:tab/>
-      </w:r>
-      <w:r>
-        <w:rPr>
-          <w:rFonts w:ascii="Georgia" w:hAnsi="Georgia"/>
-          <w:b w:val="false"/>
-          <w:bCs w:val="false"/>
-          <w:i w:val="false"/>
-          <w:iCs w:val="false"/>
-          <w:sz w:val="14"/>
-          <w:szCs w:val="14"/>
-        </w:rPr>
-        <w:t>reserve</w:t>
-      </w:r>
-    </w:p>
-    <w:p>
-      <w:pPr>
-        <w:pStyle w:val="Normal"/>
-        <w:rPr/>
-      </w:pPr>
-      <w:r>
-        <w:rPr>
-          <w:rFonts w:ascii="Georgia" w:hAnsi="Georgia"/>
-          <w:b/>
-          <w:bCs/>
-          <w:sz w:val="14"/>
-          <w:szCs w:val="14"/>
-        </w:rPr>
-        <w:tab/>
-        <w:tab/>
-      </w:r>
-      <w:r>
-        <w:rPr>
-          <w:rFonts w:ascii="Georgia" w:hAnsi="Georgia"/>
-          <w:b/>
-          <w:bCs/>
-          <w:i/>
-          <w:iCs/>
-          <w:sz w:val="14"/>
-          <w:szCs w:val="14"/>
-        </w:rPr>
-        <w:t>process-time</w:t>
-      </w:r>
-      <w:r>
-        <w:rPr>
-          <w:rFonts w:ascii="Georgia" w:hAnsi="Georgia"/>
-          <w:b/>
-          <w:bCs/>
-          <w:sz w:val="14"/>
-          <w:szCs w:val="14"/>
-        </w:rPr>
-        <w:tab/>
-      </w:r>
-      <w:r>
-        <w:rPr>
-          <w:rFonts w:ascii="Georgia" w:hAnsi="Georgia"/>
-          <w:b w:val="false"/>
-          <w:bCs w:val="false"/>
-          <w:i/>
-          <w:iCs/>
-          <w:sz w:val="14"/>
-          <w:szCs w:val="14"/>
-        </w:rPr>
-        <w:t>fixnum</w:t>
-        <w:tab/>
-      </w:r>
-      <w:r>
-        <w:rPr>
-          <w:rFonts w:ascii="Georgia" w:hAnsi="Georgia"/>
-          <w:b w:val="false"/>
-          <w:bCs w:val="false"/>
-          <w:i w:val="false"/>
-          <w:iCs w:val="false"/>
-          <w:sz w:val="14"/>
-          <w:szCs w:val="14"/>
-        </w:rPr>
-        <w:t>microseconds</w:t>
-      </w:r>
-    </w:p>
-    <w:p>
-      <w:pPr>
-        <w:pStyle w:val="Normal"/>
-        <w:rPr/>
-      </w:pPr>
-      <w:r>
-        <w:rPr>
-          <w:b/>
-          <w:bCs/>
-        </w:rPr>
-        <w:t xml:space="preserve"> </w:t>
-      </w:r>
-      <w:r>
-        <w:rPr>
-          <w:b/>
-          <w:bCs/>
-        </w:rPr>
-        <w:tab/>
-        <w:tab/>
-      </w:r>
-      <w:r>
-        <w:rPr>
-          <w:rFonts w:ascii="Georgia" w:hAnsi="Georgia"/>
-          <w:b/>
-          <w:bCs/>
-          <w:i/>
-          <w:iCs/>
-          <w:sz w:val="14"/>
-          <w:szCs w:val="14"/>
-        </w:rPr>
-        <w:t>time-units-per-sec</w:t>
-      </w:r>
-      <w:r>
-        <w:rPr>
-          <w:rFonts w:ascii="Georgia" w:hAnsi="Georgia"/>
-          <w:b/>
-          <w:bCs/>
-          <w:sz w:val="14"/>
-          <w:szCs w:val="14"/>
-        </w:rPr>
-        <w:tab/>
-      </w:r>
-      <w:r>
-        <w:rPr>
-          <w:rFonts w:ascii="Georgia" w:hAnsi="Georgia"/>
-          <w:i/>
-          <w:iCs/>
-          <w:sz w:val="14"/>
-          <w:szCs w:val="14"/>
-        </w:rPr>
-        <w:t>fixnum</w:t>
-      </w:r>
-    </w:p>
-    <w:p>
-      <w:pPr>
-        <w:pStyle w:val="Normal"/>
-        <w:rPr>
-          <w:sz w:val="16"/>
-          <w:szCs w:val="16"/>
-        </w:rPr>
-      </w:pPr>
-      <w:r>
-        <w:rPr>
-          <w:rFonts w:ascii="Georgia" w:hAnsi="Georgia"/>
-          <w:b/>
-          <w:bCs/>
-          <w:i w:val="false"/>
-          <w:iCs w:val="false"/>
-          <w:sz w:val="16"/>
-          <w:szCs w:val="16"/>
-        </w:rPr>
-        <w:t xml:space="preserve">   </w:t>
-      </w:r>
-      <w:r>
-        <w:rPr>
-          <w:rFonts w:ascii="Georgia" w:hAnsi="Georgia"/>
-          <w:b/>
-          <w:bCs/>
-          <w:i w:val="false"/>
-          <w:iCs w:val="false"/>
-          <w:sz w:val="16"/>
-          <w:szCs w:val="16"/>
-        </w:rPr>
-        <w:tab/>
-        <w:tab/>
-      </w:r>
-      <w:r>
-        <w:rPr>
-          <w:rFonts w:ascii="Georgia" w:hAnsi="Georgia"/>
-          <w:b/>
-          <w:bCs/>
-          <w:i/>
-          <w:iCs/>
-          <w:sz w:val="14"/>
-          <w:szCs w:val="14"/>
-        </w:rPr>
-        <w:t>process-fds</w:t>
-      </w:r>
-      <w:r>
-        <w:rPr>
-          <w:rFonts w:ascii="Georgia" w:hAnsi="Georgia"/>
-          <w:b/>
-          <w:bCs/>
-          <w:i/>
-          <w:iCs/>
-          <w:sz w:val="14"/>
-          <w:szCs w:val="14"/>
-        </w:rPr>
-        <w:t xml:space="preserve"> </w:t>
-      </w:r>
-      <w:r>
-        <w:rPr>
-          <w:rFonts w:ascii="Georgia" w:hAnsi="Georgia"/>
-          <w:b w:val="false"/>
-          <w:bCs w:val="false"/>
-          <w:i/>
-          <w:iCs/>
-          <w:sz w:val="14"/>
-          <w:szCs w:val="14"/>
-        </w:rPr>
+        <w:tab/>
         <w:tab/>
       </w:r>
       <w:r>
         <w:rPr>
           <w:rFonts w:eastAsia="Songti SC" w:cs="Arial Unicode MS" w:ascii="Georgia" w:hAnsi="Georgia"/>
-          <w:b w:val="false"/>
-          <w:bCs w:val="false"/>
+          <w:b/>
+          <w:bCs/>
           <w:i/>
           <w:iCs/>
           <w:color w:val="auto"/>
           <w:kern w:val="2"/>
-          <w:sz w:val="16"/>
-          <w:szCs w:val="16"/>
+          <w:sz w:val="14"/>
+          <w:szCs w:val="14"/>
           <w:u w:val="none"/>
           <w:lang w:val="en-US" w:eastAsia="zh-CN" w:bidi="hi-IN"/>
         </w:rPr>
-        <w:t>list</w:t>
-        <w:tab/>
-      </w:r>
-      <w:r>
-        <w:rPr>
-          <w:rFonts w:eastAsia="Songti SC" w:cs="Arial Unicode MS" w:ascii="Georgia" w:hAnsi="Georgia"/>
-          <w:b w:val="false"/>
-          <w:bCs w:val="false"/>
-          <w:i/>
-          <w:iCs/>
-          <w:color w:val="auto"/>
-          <w:kern w:val="2"/>
-          <w:sz w:val="14"/>
-          <w:szCs w:val="14"/>
-          <w:u w:val="none"/>
-          <w:lang w:val="en-US" w:eastAsia="zh-CN" w:bidi="hi-IN"/>
-        </w:rPr>
-        <w:t>file descriptors</w:t>
-      </w:r>
-      <w:r>
-        <w:rPr>
-          <w:rFonts w:eastAsia="Songti SC" w:cs="Arial Unicode MS" w:ascii="Georgia" w:hAnsi="Georgia"/>
-          <w:b w:val="false"/>
-          <w:bCs w:val="false"/>
-          <w:i/>
-          <w:iCs/>
-          <w:color w:val="auto"/>
-          <w:kern w:val="2"/>
-          <w:sz w:val="16"/>
-          <w:szCs w:val="16"/>
-          <w:u w:val="none"/>
-          <w:lang w:val="en-US" w:eastAsia="zh-CN" w:bidi="hi-IN"/>
-        </w:rPr>
-        <w:t xml:space="preserve"> </w:t>
-      </w:r>
-    </w:p>
-    <w:p>
-      <w:pPr>
-        <w:pStyle w:val="Normal"/>
-        <w:rPr>
-          <w:sz w:val="16"/>
-          <w:szCs w:val="16"/>
-        </w:rPr>
-      </w:pPr>
-      <w:r>
-        <w:rPr>
-          <w:rFonts w:eastAsia="Songti SC" w:cs="Arial Unicode MS" w:ascii="Georgia" w:hAnsi="Georgia"/>
-          <w:b/>
-          <w:bCs/>
-          <w:i w:val="false"/>
-          <w:iCs w:val="false"/>
-          <w:color w:val="auto"/>
-          <w:kern w:val="2"/>
-          <w:sz w:val="16"/>
-          <w:szCs w:val="16"/>
-          <w:u w:val="none"/>
-          <w:lang w:val="en-US" w:eastAsia="zh-CN" w:bidi="hi-IN"/>
-        </w:rPr>
-        <w:t xml:space="preserve">   </w:t>
-      </w:r>
-      <w:r>
-        <w:rPr>
-          <w:rFonts w:eastAsia="Songti SC" w:cs="Arial Unicode MS" w:ascii="Georgia" w:hAnsi="Georgia"/>
-          <w:b/>
-          <w:bCs/>
-          <w:i w:val="false"/>
-          <w:iCs w:val="false"/>
-          <w:color w:val="auto"/>
-          <w:kern w:val="2"/>
-          <w:sz w:val="16"/>
-          <w:szCs w:val="16"/>
-          <w:u w:val="none"/>
-          <w:lang w:val="en-US" w:eastAsia="zh-CN" w:bidi="hi-IN"/>
-        </w:rPr>
-        <w:tab/>
-        <w:tab/>
-      </w:r>
-      <w:r>
-        <w:rPr>
-          <w:rFonts w:eastAsia="Songti SC" w:cs="Arial Unicode MS" w:ascii="Georgia" w:hAnsi="Georgia"/>
-          <w:b/>
-          <w:bCs/>
-          <w:i/>
-          <w:iCs/>
-          <w:color w:val="auto"/>
-          <w:kern w:val="2"/>
-          <w:sz w:val="14"/>
-          <w:szCs w:val="14"/>
-          <w:u w:val="none"/>
-          <w:lang w:val="en-US" w:eastAsia="zh-CN" w:bidi="hi-IN"/>
-        </w:rPr>
-        <w:t>sleep</w:t>
-      </w:r>
-      <w:r>
-        <w:rPr>
-          <w:rFonts w:eastAsia="Songti SC" w:cs="Arial Unicode MS" w:ascii="Georgia" w:hAnsi="Georgia"/>
-          <w:b/>
-          <w:bCs/>
-          <w:i/>
-          <w:iCs/>
-          <w:color w:val="auto"/>
-          <w:kern w:val="2"/>
-          <w:sz w:val="14"/>
-          <w:szCs w:val="14"/>
-          <w:u w:val="none"/>
-          <w:lang w:val="en-US" w:eastAsia="zh-CN" w:bidi="hi-IN"/>
-        </w:rPr>
-        <w:t xml:space="preserve"> </w:t>
+        <w:t xml:space="preserve">sleep </w:t>
       </w:r>
       <w:r>
         <w:rPr>
@@ -15487,6 +15494,111 @@
           <w:u w:val="none"/>
           <w:lang w:val="en-US" w:eastAsia="zh-CN" w:bidi="hi-IN"/>
         </w:rPr>
+        <w:t>env-info</w:t>
+      </w:r>
+      <w:r>
+        <w:rPr>
+          <w:rFonts w:eastAsia="Songti SC" w:cs="Arial Unicode MS" w:ascii="Georgia" w:hAnsi="Georgia"/>
+          <w:b/>
+          <w:bCs/>
+          <w:i w:val="false"/>
+          <w:iCs w:val="false"/>
+          <w:color w:val="auto"/>
+          <w:kern w:val="2"/>
+          <w:sz w:val="14"/>
+          <w:szCs w:val="14"/>
+          <w:u w:val="none"/>
+          <w:lang w:val="en-US" w:eastAsia="zh-CN" w:bidi="hi-IN"/>
+        </w:rPr>
+        <w:tab/>
+        <w:tab/>
+      </w:r>
+      <w:r>
+        <w:rPr>
+          <w:rFonts w:eastAsia="Songti SC" w:cs="Arial Unicode MS" w:ascii="Georgia" w:hAnsi="Georgia"/>
+          <w:b w:val="false"/>
+          <w:bCs w:val="false"/>
+          <w:i/>
+          <w:iCs/>
+          <w:color w:val="auto"/>
+          <w:kern w:val="2"/>
+          <w:sz w:val="14"/>
+          <w:szCs w:val="14"/>
+          <w:u w:val="none"/>
+          <w:lang w:val="en-US" w:eastAsia="zh-CN" w:bidi="hi-IN"/>
+        </w:rPr>
+        <w:t>list</w:t>
+        <w:tab/>
+      </w:r>
+      <w:r>
+        <w:rPr>
+          <w:rFonts w:eastAsia="Songti SC" w:cs="Arial Unicode MS" w:ascii="Georgia" w:hAnsi="Georgia"/>
+          <w:b w:val="false"/>
+          <w:bCs w:val="false"/>
+          <w:i w:val="false"/>
+          <w:iCs w:val="false"/>
+          <w:color w:val="auto"/>
+          <w:kern w:val="2"/>
+          <w:sz w:val="14"/>
+          <w:szCs w:val="14"/>
+          <w:u w:val="none"/>
+          <w:lang w:val="en-US" w:eastAsia="zh-CN" w:bidi="hi-IN"/>
+        </w:rPr>
+        <w:t>env info</w:t>
+      </w:r>
+      <w:r>
+        <w:rPr>
+          <w:rFonts w:eastAsia="Songti SC" w:cs="Arial Unicode MS" w:ascii="Georgia" w:hAnsi="Georgia"/>
+          <w:b/>
+          <w:bCs/>
+          <w:i w:val="false"/>
+          <w:iCs w:val="false"/>
+          <w:color w:val="auto"/>
+          <w:kern w:val="2"/>
+          <w:sz w:val="16"/>
+          <w:szCs w:val="16"/>
+          <w:u w:val="none"/>
+          <w:lang w:val="en-US" w:eastAsia="zh-CN" w:bidi="hi-IN"/>
+        </w:rPr>
+        <w:tab/>
+      </w:r>
+    </w:p>
+    <w:p>
+      <w:pPr>
+        <w:pStyle w:val="Normal"/>
+        <w:rPr/>
+      </w:pPr>
+      <w:r>
+        <w:rPr>
+          <w:rFonts w:eastAsia="Songti SC" w:cs="Arial Unicode MS" w:ascii="Georgia" w:hAnsi="Georgia"/>
+          <w:b/>
+          <w:bCs/>
+          <w:i w:val="false"/>
+          <w:iCs w:val="false"/>
+          <w:color w:val="auto"/>
+          <w:kern w:val="2"/>
+          <w:sz w:val="16"/>
+          <w:szCs w:val="16"/>
+          <w:u w:val="none"/>
+          <w:lang w:val="en-US" w:eastAsia="zh-CN" w:bidi="hi-IN"/>
+        </w:rPr>
+        <w:tab/>
+        <w:tab/>
+      </w:r>
+      <w:r>
+        <w:rPr>
+          <w:rFonts w:eastAsia="Songti SC" w:cs="Arial Unicode MS" w:ascii="Georgia" w:hAnsi="Georgia"/>
+          <w:b/>
+          <w:bCs/>
+          <w:i/>
+          <w:iCs/>
+          <w:color w:val="auto"/>
+          <w:kern w:val="2"/>
+          <w:sz w:val="14"/>
+          <w:szCs w:val="14"/>
+          <w:u w:val="none"/>
+          <w:lang w:val="en-US" w:eastAsia="zh-CN" w:bidi="hi-IN"/>
+        </w:rPr>
         <w:t>heap-info</w:t>
       </w:r>
       <w:r>
@@ -16140,14 +16252,15 @@
         </w:rPr>
         <w:tab/>
         <w:tab/>
+        <w:t>symbols</w:t>
       </w:r>
       <w:r>
         <w:rPr>
           <w:rFonts w:eastAsia="Songti SC" w:cs="Arial Unicode MS" w:ascii="Georgia" w:hAnsi="Georgia"/>
           <w:b/>
           <w:bCs/>
-          <w:i/>
-          <w:iCs/>
+          <w:i w:val="false"/>
+          <w:iCs w:val="false"/>
           <w:color w:val="auto"/>
           <w:kern w:val="2"/>
           <w:sz w:val="14"/>
@@ -16155,15 +16268,15 @@
           <w:u w:val="none"/>
           <w:lang w:val="en-US" w:eastAsia="zh-CN" w:bidi="hi-IN"/>
         </w:rPr>
-        <w:t>symbols</w:t>
+        <w:t xml:space="preserve"> </w:t>
       </w:r>
       <w:r>
         <w:rPr>
           <w:rFonts w:eastAsia="Songti SC" w:cs="Arial Unicode MS" w:ascii="Georgia" w:hAnsi="Georgia"/>
-          <w:b/>
-          <w:bCs/>
-          <w:i w:val="false"/>
-          <w:iCs w:val="false"/>
+          <w:b w:val="false"/>
+          <w:bCs w:val="false"/>
+          <w:i/>
+          <w:iCs/>
           <w:color w:val="auto"/>
           <w:kern w:val="2"/>
           <w:sz w:val="14"/>
@@ -16171,15 +16284,15 @@
           <w:u w:val="none"/>
           <w:lang w:val="en-US" w:eastAsia="zh-CN" w:bidi="hi-IN"/>
         </w:rPr>
-        <w:t xml:space="preserve"> </w:t>
+        <w:t>ns</w:t>
       </w:r>
       <w:r>
         <w:rPr>
           <w:rFonts w:eastAsia="Songti SC" w:cs="Arial Unicode MS" w:ascii="Georgia" w:hAnsi="Georgia"/>
-          <w:b w:val="false"/>
-          <w:bCs w:val="false"/>
-          <w:i/>
-          <w:iCs/>
+          <w:b/>
+          <w:bCs/>
+          <w:i w:val="false"/>
+          <w:iCs w:val="false"/>
           <w:color w:val="auto"/>
           <w:kern w:val="2"/>
           <w:sz w:val="14"/>
@@ -16187,15 +16300,15 @@
           <w:u w:val="none"/>
           <w:lang w:val="en-US" w:eastAsia="zh-CN" w:bidi="hi-IN"/>
         </w:rPr>
-        <w:t>ns</w:t>
+        <w:tab/>
       </w:r>
       <w:r>
         <w:rPr>
           <w:rFonts w:eastAsia="Songti SC" w:cs="Arial Unicode MS" w:ascii="Georgia" w:hAnsi="Georgia"/>
-          <w:b/>
-          <w:bCs/>
-          <w:i w:val="false"/>
-          <w:iCs w:val="false"/>
+          <w:b w:val="false"/>
+          <w:bCs w:val="false"/>
+          <w:i/>
+          <w:iCs/>
           <w:color w:val="auto"/>
           <w:kern w:val="2"/>
           <w:sz w:val="14"/>
@@ -16203,54 +16316,8 @@
           <w:u w:val="none"/>
           <w:lang w:val="en-US" w:eastAsia="zh-CN" w:bidi="hi-IN"/>
         </w:rPr>
-        <w:tab/>
-      </w:r>
-      <w:r>
-        <w:rPr>
-          <w:rFonts w:eastAsia="Songti SC" w:cs="Arial Unicode MS" w:ascii="Georgia" w:hAnsi="Georgia"/>
-          <w:b w:val="false"/>
-          <w:bCs w:val="false"/>
-          <w:i/>
-          <w:iCs/>
-          <w:color w:val="auto"/>
-          <w:kern w:val="2"/>
-          <w:sz w:val="14"/>
-          <w:szCs w:val="14"/>
-          <w:u w:val="none"/>
-          <w:lang w:val="en-US" w:eastAsia="zh-CN" w:bidi="hi-IN"/>
-        </w:rPr>
         <w:t>list</w:t>
-      </w:r>
-      <w:r>
-        <w:rPr>
-          <w:rFonts w:eastAsia="Songti SC" w:cs="Arial Unicode MS" w:ascii="Georgia" w:hAnsi="Georgia"/>
-          <w:b w:val="false"/>
-          <w:bCs w:val="false"/>
-          <w:i/>
-          <w:iCs/>
-          <w:color w:val="auto"/>
-          <w:kern w:val="2"/>
-          <w:sz w:val="14"/>
-          <w:szCs w:val="14"/>
-          <w:u w:val="none"/>
-          <w:lang w:val="en-US" w:eastAsia="zh-CN" w:bidi="hi-IN"/>
-        </w:rPr>
-        <w:tab/>
-      </w:r>
-      <w:r>
-        <w:rPr>
-          <w:rFonts w:eastAsia="Songti SC" w:cs="Arial Unicode MS" w:ascii="Georgia" w:hAnsi="Georgia"/>
-          <w:b w:val="false"/>
-          <w:bCs w:val="false"/>
-          <w:i/>
-          <w:iCs/>
-          <w:color w:val="auto"/>
-          <w:kern w:val="2"/>
-          <w:sz w:val="14"/>
-          <w:szCs w:val="14"/>
-          <w:u w:val="none"/>
-          <w:lang w:val="en-US" w:eastAsia="zh-CN" w:bidi="hi-IN"/>
-        </w:rPr>
+        <w:tab/>
         <w:t>ns symbol</w:t>
       </w:r>
       <w:r>
@@ -17333,44 +17400,10 @@
       <w:pPr>
         <w:pStyle w:val="Normal"/>
         <w:rPr>
-          <w:rFonts w:ascii="Georgia" w:hAnsi="Georgia"/>
-          <w:sz w:val="14"/>
-          <w:szCs w:val="14"/>
-        </w:rPr>
-      </w:pPr>
-      <w:r>
-        <w:rPr>
-          <w:rFonts w:ascii="Georgia" w:hAnsi="Georgia"/>
-          <w:sz w:val="14"/>
-          <w:szCs w:val="14"/>
-        </w:rPr>
-      </w:r>
-    </w:p>
-    <w:p>
-      <w:pPr>
-        <w:pStyle w:val="Normal"/>
-        <w:rPr>
           <w:sz w:val="24"/>
           <w:szCs w:val="24"/>
         </w:rPr>
       </w:pPr>
-      <w:r>
-        <w:rPr>
-          <w:rFonts w:eastAsia="Songti SC" w:cs="Arial Unicode MS" w:ascii="Georgia" w:hAnsi="Georgia"/>
-          <w:b/>
-          <w:bCs/>
-          <w:i/>
-          <w:iCs/>
-          <w:color w:val="FFFFFF"/>
-          <w:kern w:val="2"/>
-          <w:sz w:val="24"/>
-          <w:szCs w:val="24"/>
-          <w:u w:val="none"/>
-          <w:shd w:fill="333333" w:val="clear"/>
-          <w:lang w:val="en-US" w:eastAsia="zh-CN" w:bidi="hi-IN"/>
-        </w:rPr>
-        <w:t xml:space="preserve"> </w:t>
-      </w:r>
       <w:r>
         <w:rPr>
           <w:rFonts w:ascii="Georgia" w:hAnsi="Georgia"/>
@@ -19039,8 +19072,6 @@
         <w:pStyle w:val="Normal"/>
         <w:rPr>
           <w:rFonts w:ascii="Georgia" w:hAnsi="Georgia"/>
-          <w:b/>
-          <w:bCs/>
           <w:sz w:val="12"/>
           <w:szCs w:val="12"/>
         </w:rPr>
@@ -19048,8 +19079,6 @@
       <w:r>
         <w:rPr>
           <w:rFonts w:ascii="Georgia" w:hAnsi="Georgia"/>
-          <w:b/>
-          <w:bCs/>
           <w:sz w:val="12"/>
           <w:szCs w:val="12"/>
         </w:rPr>
@@ -22014,19 +22043,22 @@
         <w:spacing w:before="57" w:after="57"/>
         <w:ind w:hanging="0" w:left="0"/>
         <w:rPr>
-          <w:rFonts w:ascii="Andale Mono" w:hAnsi="Andale Mono"/>
-          <w:color w:val="auto"/>
-          <w:sz w:val="12"/>
-          <w:szCs w:val="12"/>
-        </w:rPr>
-      </w:pPr>
-      <w:r>
-        <w:rPr>
-          <w:rFonts w:ascii="Andale Mono" w:hAnsi="Andale Mono"/>
-          <w:color w:val="auto"/>
-          <w:sz w:val="12"/>
-          <w:szCs w:val="12"/>
-        </w:rPr>
+          <w:rFonts w:ascii="Georgia" w:hAnsi="Georgia"/>
+          <w:b w:val="false"/>
+          <w:bCs w:val="false"/>
+          <w:i w:val="false"/>
+          <w:i w:val="false"/>
+          <w:iCs w:val="false"/>
+          <w:caps w:val="false"/>
+          <w:smallCaps w:val="false"/>
+          <w:color w:val="auto"/>
+          <w:spacing w:val="0"/>
+          <w:sz w:val="16"/>
+          <w:szCs w:val="16"/>
+        </w:rPr>
+      </w:pPr>
+      <w:r>
+        <w:rPr/>
       </w:r>
     </w:p>
     <w:p>

</xml_diff>

<commit_message>
#1099 - describe: add verbose
</commit_message>
<xml_diff>
--- a/doc/refcards/mu-ref.docx
+++ b/doc/refcards/mu-ref.docx
@@ -64,7 +64,7 @@
           <w:tab w:val="left" w:pos="4110" w:leader="none"/>
         </w:tabs>
         <w:suppressAutoHyphens w:val="true"/>
-        <w:overflowPunct w:val="true"/>
+        <w:overflowPunct w:val="false"/>
         <w:bidi w:val="0"/>
         <w:spacing w:before="0" w:after="0"/>
         <w:ind w:hanging="0" w:left="0" w:right="0"/>
@@ -375,7 +375,19 @@
           <w:sz w:val="16"/>
           <w:szCs w:val="16"/>
         </w:rPr>
-        <w:t>0.2.19</w:t>
+        <w:t>0.2.</w:t>
+      </w:r>
+      <w:r>
+        <w:rPr>
+          <w:rFonts w:ascii="Georgia" w:hAnsi="Georgia"/>
+          <w:b/>
+          <w:bCs/>
+          <w:i/>
+          <w:iCs/>
+          <w:sz w:val="16"/>
+          <w:szCs w:val="16"/>
+        </w:rPr>
+        <w:t>20</w:t>
       </w:r>
     </w:p>
     <w:p>
@@ -2161,7 +2173,7 @@
         <w:pStyle w:val="Normal"/>
         <w:widowControl/>
         <w:suppressAutoHyphens w:val="true"/>
-        <w:overflowPunct w:val="true"/>
+        <w:overflowPunct w:val="false"/>
         <w:bidi w:val="0"/>
         <w:spacing w:before="0" w:after="0"/>
         <w:ind w:hanging="0" w:left="0" w:right="0"/>
@@ -5590,7 +5602,7 @@
         <w:pStyle w:val="Normal"/>
         <w:widowControl/>
         <w:suppressAutoHyphens w:val="true"/>
-        <w:overflowPunct w:val="true"/>
+        <w:overflowPunct w:val="false"/>
         <w:bidi w:val="0"/>
         <w:spacing w:before="0" w:after="0"/>
         <w:ind w:hanging="0" w:left="0" w:right="0"/>
@@ -22058,7 +22070,19 @@
         </w:rPr>
       </w:pPr>
       <w:r>
-        <w:rPr/>
+        <w:rPr>
+          <w:rFonts w:ascii="Georgia" w:hAnsi="Georgia"/>
+          <w:b w:val="false"/>
+          <w:bCs w:val="false"/>
+          <w:i w:val="false"/>
+          <w:iCs w:val="false"/>
+          <w:caps w:val="false"/>
+          <w:smallCaps w:val="false"/>
+          <w:color w:val="auto"/>
+          <w:spacing w:val="0"/>
+          <w:sz w:val="16"/>
+          <w:szCs w:val="16"/>
+        </w:rPr>
       </w:r>
     </w:p>
     <w:p>
@@ -23814,7 +23838,7 @@
     <w:pPr>
       <w:widowControl/>
       <w:suppressAutoHyphens w:val="true"/>
-      <w:overflowPunct w:val="true"/>
+      <w:overflowPunct w:val="false"/>
       <w:bidi w:val="0"/>
       <w:spacing w:before="0" w:after="0"/>
       <w:jc w:val="left"/>

</xml_diff>

<commit_message>
#1103 - runtime: better size-of native function
</commit_message>
<xml_diff>
--- a/doc/refcards/mu-ref.docx
+++ b/doc/refcards/mu-ref.docx
@@ -64,7 +64,7 @@
           <w:tab w:val="left" w:pos="4110" w:leader="none"/>
         </w:tabs>
         <w:suppressAutoHyphens w:val="true"/>
-        <w:overflowPunct w:val="false"/>
+        <w:overflowPunct w:val="true"/>
         <w:bidi w:val="0"/>
         <w:spacing w:before="0" w:after="0"/>
         <w:ind w:hanging="0" w:left="0" w:right="0"/>
@@ -375,19 +375,7 @@
           <w:sz w:val="16"/>
           <w:szCs w:val="16"/>
         </w:rPr>
-        <w:t>0.2.</w:t>
-      </w:r>
-      <w:r>
-        <w:rPr>
-          <w:rFonts w:ascii="Georgia" w:hAnsi="Georgia"/>
-          <w:b/>
-          <w:bCs/>
-          <w:i/>
-          <w:iCs/>
-          <w:sz w:val="16"/>
-          <w:szCs w:val="16"/>
-        </w:rPr>
-        <w:t>20</w:t>
+        <w:t>0.2.20</w:t>
       </w:r>
     </w:p>
     <w:p>
@@ -1859,7 +1847,7 @@
           <w:sz w:val="16"/>
           <w:szCs w:val="16"/>
         </w:rPr>
-        <w:t xml:space="preserve"> </w:t>
+        <w:t xml:space="preserve">  </w:t>
       </w:r>
       <w:r>
         <w:rPr>
@@ -2173,7 +2161,7 @@
         <w:pStyle w:val="Normal"/>
         <w:widowControl/>
         <w:suppressAutoHyphens w:val="true"/>
-        <w:overflowPunct w:val="false"/>
+        <w:overflowPunct w:val="true"/>
         <w:bidi w:val="0"/>
         <w:spacing w:before="0" w:after="0"/>
         <w:ind w:hanging="0" w:left="0" w:right="0"/>
@@ -3045,7 +3033,8 @@
           <w:sz w:val="16"/>
           <w:szCs w:val="16"/>
         </w:rPr>
-        <w:t>for</w:t>
+        <w:t>T</w:t>
+        <w:tab/>
       </w:r>
       <w:r>
         <w:rPr>
@@ -5602,7 +5591,7 @@
         <w:pStyle w:val="Normal"/>
         <w:widowControl/>
         <w:suppressAutoHyphens w:val="true"/>
-        <w:overflowPunct w:val="false"/>
+        <w:overflowPunct w:val="true"/>
         <w:bidi w:val="0"/>
         <w:spacing w:before="0" w:after="0"/>
         <w:ind w:hanging="0" w:left="0" w:right="0"/>
@@ -23838,7 +23827,7 @@
     <w:pPr>
       <w:widowControl/>
       <w:suppressAutoHyphens w:val="true"/>
-      <w:overflowPunct w:val="false"/>
+      <w:overflowPunct w:val="true"/>
       <w:bidi w:val="0"/>
       <w:spacing w:before="0" w:after="0"/>
       <w:jc w:val="left"/>

</xml_diff>